<commit_message>
docs: mise a jour complete des 3 propositions methodologiques detaillees et vulgarisees (Word, Markdown et scripts)
</commit_message>
<xml_diff>
--- a/docs/Propositions_Methodologiques_SIMACCUEIL.docx
+++ b/docs/Propositions_Methodologiques_SIMACCUEIL.docx
@@ -15,7 +15,7 @@
         </w:rPr>
         <w:t>HAUTE ÉCOLE CHARLEMAGNE (HECh) — HAUTE ÉCOLE DE LIÈGE (HEL)</w:t>
         <w:br/>
-        <w:t>LABORATOIRE DE RECHERCHE LAB-DRA</w:t>
+        <w:t>LABORATOIRE DE RECHERCHE APPLIQUÉE LAB-DRA</w:t>
       </w:r>
     </w:p>
     <w:p>
@@ -29,12 +29,12 @@
           <w:color w:val="1B365D"/>
           <w:sz w:val="48"/>
         </w:rPr>
-        <w:t>DOCUMENT D'ORIENTATION MÉTHODOLOGIQUE</w:t>
+        <w:t>GUIDE MÉTHODOLOGIQUE OPÉRATIONNEL &amp; VULGARISÉ</w:t>
       </w:r>
     </w:p>
     <w:p>
       <w:pPr>
-        <w:spacing w:after="480"/>
+        <w:spacing w:after="400"/>
       </w:pPr>
       <w:r>
         <w:rPr>
@@ -44,7 +44,7 @@
         </w:rPr>
         <w:t>Trois Propositions Méthodologiques Détaillées pour le Projet SIMACCUEIL</w:t>
         <w:br/>
-        <w:t>Oculométrie Mobile (Pupil Labs Neon), Didactique Professionnelle &amp; Accueil Hôtelier (Upselling &amp; Réclamation)</w:t>
+        <w:t>Oculométrie Mobile (Pupil Labs Neon), Didactique Professionnelle &amp; Accueil Hôtelier (Upselling &amp; Réclamations)</w:t>
       </w:r>
     </w:p>
     <w:tbl>
@@ -181,7 +181,7 @@
                 <w:color w:val="1B365D"/>
                 <w:sz w:val="19"/>
               </w:rPr>
-              <w:t>Dispositif Expérimental</w:t>
+              <w:t>Matériel d'Expérimentation</w:t>
             </w:r>
           </w:p>
         </w:tc>
@@ -205,7 +205,7 @@
                 <w:color w:val="2C3E50"/>
                 <w:sz w:val="19"/>
               </w:rPr>
-              <w:t>Lunettes d'Eye Tracking Mobile Pupil Labs Neon (200 Hz) &amp; Simulateur PMS</w:t>
+              <w:t>Lunettes d'Eye Tracking Mobile Pupil Labs Neon (200 Hz), Écran PMS &amp; Tablette</w:t>
             </w:r>
           </w:p>
         </w:tc>
@@ -232,7 +232,7 @@
                 <w:color w:val="1B365D"/>
                 <w:sz w:val="19"/>
               </w:rPr>
-              <w:t>Finalité Stratégique</w:t>
+              <w:t>Destinataires &amp; Finalités</w:t>
             </w:r>
           </w:p>
         </w:tc>
@@ -256,7 +256,7 @@
                 <w:color w:val="2C3E50"/>
                 <w:sz w:val="19"/>
               </w:rPr>
-              <w:t>Dépôt projets de recherche appliquée, financements compétitifs &amp; innovation didactique</w:t>
+              <w:t>Conseil de Recherche Lab-DRA, corps professoral HECh/HEL &amp; partenaires hôteliers</w:t>
             </w:r>
           </w:p>
         </w:tc>
@@ -278,15 +278,167 @@
           <w:color w:val="1B365D"/>
           <w:sz w:val="32"/>
         </w:rPr>
-        <w:t>1. Cadrage Épistémologique &amp; Matrice Comparée des Propositions</w:t>
+        <w:t>1. Avant-propos : Glossaire &amp; Principes Clés Vulgarisés</w:t>
       </w:r>
     </w:p>
     <w:p>
       <w:pPr>
-        <w:spacing w:line="276" w:lineRule="auto" w:after="200"/>
+        <w:spacing w:after="80"/>
+        <w:ind w:left="288"/>
       </w:pPr>
       <w:r>
-        <w:t>Le projet de recherche appliquée SIMACCUEIL étudie la relation de service en réception hôtelière à travers deux situations professionnelles critiques : l'upselling commercial (surclassement en chambre supérieure) et la gestion bienveillante d'une réclamation client. Pour répondre aux exigences de scientificité du Lab-DRA et aux finalités didactiques de l'HECh/HEL, trois propositions méthodologiques complètes et articulées à l'état de l'art consolidé (22 références) sont formulées ci-dessous.</w:t>
+        <w:rPr>
+          <w:b/>
+          <w:color w:val="0E86D4"/>
+          <w:sz w:val="20"/>
+        </w:rPr>
+        <w:t xml:space="preserve">• Oculométrie mobile (Eye Tracking mobile) : </w:t>
+      </w:r>
+      <w:r>
+        <w:rPr>
+          <w:color w:val="2C3E50"/>
+          <w:sz w:val="20"/>
+        </w:rPr>
+        <w:t>Technique de mesure du regard au moyen de lunettes légères (Pupil Labs Neon). Elle permet aux participants de bouger librement et d'interagir face-à-face avec une personne réelle tout en consultant un écran.</w:t>
+      </w:r>
+    </w:p>
+    <w:p>
+      <w:pPr>
+        <w:spacing w:after="80"/>
+        <w:ind w:left="288"/>
+      </w:pPr>
+      <w:r>
+        <w:rPr>
+          <w:b/>
+          <w:color w:val="0E86D4"/>
+          <w:sz w:val="20"/>
+        </w:rPr>
+        <w:t xml:space="preserve">• Fixation &amp; Saccade : </w:t>
+      </w:r>
+      <w:r>
+        <w:rPr>
+          <w:color w:val="2C3E50"/>
+          <w:sz w:val="20"/>
+        </w:rPr>
+        <w:t>Une fixation est un arrêt du regard (au moins 100 ms) où le cerveau traite l'information. Une saccade est le saut rapide (20-40 ms) d'un point à un autre, pendant lequel la vision est neutralisée.</w:t>
+      </w:r>
+    </w:p>
+    <w:p>
+      <w:pPr>
+        <w:spacing w:after="80"/>
+        <w:ind w:left="288"/>
+      </w:pPr>
+      <w:r>
+        <w:rPr>
+          <w:b/>
+          <w:color w:val="0E86D4"/>
+          <w:sz w:val="20"/>
+        </w:rPr>
+        <w:t xml:space="preserve">• Zones d'Intérêt (AOI - Areas of Interest) : </w:t>
+      </w:r>
+      <w:r>
+        <w:rPr>
+          <w:color w:val="2C3E50"/>
+          <w:sz w:val="20"/>
+        </w:rPr>
+        <w:t>Régions découpées sur l'image pour quantifier l'attention (AOI statiques sur l'écran d'ordinateur fixe vs AOI dynamiques sur le visage du client en mouvement ou la tablette).</w:t>
+      </w:r>
+    </w:p>
+    <w:p>
+      <w:pPr>
+        <w:spacing w:after="80"/>
+        <w:ind w:left="288"/>
+      </w:pPr>
+      <w:r>
+        <w:rPr>
+          <w:b/>
+          <w:color w:val="0E86D4"/>
+          <w:sz w:val="20"/>
+        </w:rPr>
+        <w:t xml:space="preserve">• Charge cognitive (CLT) : </w:t>
+      </w:r>
+      <w:r>
+        <w:rPr>
+          <w:color w:val="2C3E50"/>
+          <w:sz w:val="20"/>
+        </w:rPr>
+        <w:t>Quantité d'effort mental mobilisée en mémoire de travail. La charge extrinsèque est le gaspillage d'énergie causé par un logiciel mal maîtrisé ; son automatisation libère de l'espace mental pour regarder le client.</w:t>
+      </w:r>
+    </w:p>
+    <w:p>
+      <w:pPr>
+        <w:spacing w:after="80"/>
+        <w:ind w:left="288"/>
+      </w:pPr>
+      <w:r>
+        <w:rPr>
+          <w:b/>
+          <w:color w:val="0E86D4"/>
+          <w:sz w:val="20"/>
+        </w:rPr>
+        <w:t xml:space="preserve">• PMS (Property Management System) : </w:t>
+      </w:r>
+      <w:r>
+        <w:rPr>
+          <w:color w:val="2C3E50"/>
+          <w:sz w:val="20"/>
+        </w:rPr>
+        <w:t>Logiciel hôtelier utilisé à la réception pour vérifier les réservations, attribuer les chambres et enregistrer les arrivées.</w:t>
+      </w:r>
+    </w:p>
+    <w:p>
+      <w:pPr>
+        <w:spacing w:after="80"/>
+        <w:ind w:left="288"/>
+      </w:pPr>
+      <w:r>
+        <w:rPr>
+          <w:b/>
+          <w:color w:val="0E86D4"/>
+          <w:sz w:val="20"/>
+        </w:rPr>
+        <w:t xml:space="preserve">• Upselling : </w:t>
+      </w:r>
+      <w:r>
+        <w:rPr>
+          <w:color w:val="2C3E50"/>
+          <w:sz w:val="20"/>
+        </w:rPr>
+        <w:t>Technique commerciale proposant au client une prestation supérieure à celle réservée (chambre surclassée, suite, options) moyennant un supplément tarifaire négocié.</w:t>
+      </w:r>
+    </w:p>
+    <w:p>
+      <w:pPr>
+        <w:spacing w:after="80"/>
+        <w:ind w:left="288"/>
+      </w:pPr>
+      <w:r>
+        <w:rPr>
+          <w:b/>
+          <w:color w:val="0E86D4"/>
+          <w:sz w:val="20"/>
+        </w:rPr>
+        <w:t xml:space="preserve">• EMME (Eye-Movement Modelling Examples) : </w:t>
+      </w:r>
+      <w:r>
+        <w:rPr>
+          <w:color w:val="2C3E50"/>
+          <w:sz w:val="20"/>
+        </w:rPr>
+        <w:t>Méthode d'apprentissage par observation où l'étudiant visionne une vidéo montrant les gestes d'un expert avec la superposition dynamique de son regard.</w:t>
+      </w:r>
+    </w:p>
+    <w:p>
+      <w:pPr>
+        <w:spacing w:before="280" w:after="120"/>
+      </w:pPr>
+      <w:r>
+        <w:rPr>
+          <w:b/>
+          <w:color w:val="1B365D"/>
+          <w:sz w:val="24"/>
+        </w:rPr>
+        <w:t>Tableau Comparatif des Trois Trajectoires Méthodologiques</w:t>
       </w:r>
     </w:p>
     <w:tbl>
@@ -307,10 +459,10 @@
             <w:tcW w:type="dxa" w:w="2340"/>
             <w:shd w:val="clear" w:color="auto" w:fill="1B365D"/>
             <w:tcMar>
-              <w:top w:w="100" w:type="dxa"/>
-              <w:bottom w:w="100" w:type="dxa"/>
-              <w:left w:w="100" w:type="dxa"/>
-              <w:right w:w="100" w:type="dxa"/>
+              <w:top w:w="80" w:type="dxa"/>
+              <w:bottom w:w="80" w:type="dxa"/>
+              <w:left w:w="80" w:type="dxa"/>
+              <w:right w:w="80" w:type="dxa"/>
             </w:tcMar>
           </w:tcPr>
           <w:p>
@@ -321,7 +473,7 @@
               <w:rPr>
                 <w:b/>
                 <w:color w:val="FFFFFF"/>
-                <w:sz w:val="18"/>
+                <w:sz w:val="17"/>
               </w:rPr>
               <w:t>Critère</w:t>
             </w:r>
@@ -332,10 +484,10 @@
             <w:tcW w:type="dxa" w:w="2340"/>
             <w:shd w:val="clear" w:color="auto" w:fill="1B365D"/>
             <w:tcMar>
-              <w:top w:w="100" w:type="dxa"/>
-              <w:bottom w:w="100" w:type="dxa"/>
-              <w:left w:w="100" w:type="dxa"/>
-              <w:right w:w="100" w:type="dxa"/>
+              <w:top w:w="80" w:type="dxa"/>
+              <w:bottom w:w="80" w:type="dxa"/>
+              <w:left w:w="80" w:type="dxa"/>
+              <w:right w:w="80" w:type="dxa"/>
             </w:tcMar>
           </w:tcPr>
           <w:p>
@@ -346,7 +498,7 @@
               <w:rPr>
                 <w:b/>
                 <w:color w:val="FFFFFF"/>
-                <w:sz w:val="18"/>
+                <w:sz w:val="17"/>
               </w:rPr>
               <w:t>Proposition 1 : Comparatif</w:t>
             </w:r>
@@ -357,10 +509,10 @@
             <w:tcW w:type="dxa" w:w="2340"/>
             <w:shd w:val="clear" w:color="auto" w:fill="1B365D"/>
             <w:tcMar>
-              <w:top w:w="100" w:type="dxa"/>
-              <w:bottom w:w="100" w:type="dxa"/>
-              <w:left w:w="100" w:type="dxa"/>
-              <w:right w:w="100" w:type="dxa"/>
+              <w:top w:w="80" w:type="dxa"/>
+              <w:bottom w:w="80" w:type="dxa"/>
+              <w:left w:w="80" w:type="dxa"/>
+              <w:right w:w="80" w:type="dxa"/>
             </w:tcMar>
           </w:tcPr>
           <w:p>
@@ -371,7 +523,7 @@
               <w:rPr>
                 <w:b/>
                 <w:color w:val="FFFFFF"/>
-                <w:sz w:val="18"/>
+                <w:sz w:val="17"/>
               </w:rPr>
               <w:t>Proposition 2 : EMME</w:t>
             </w:r>
@@ -382,10 +534,10 @@
             <w:tcW w:type="dxa" w:w="2340"/>
             <w:shd w:val="clear" w:color="auto" w:fill="1B365D"/>
             <w:tcMar>
-              <w:top w:w="100" w:type="dxa"/>
-              <w:bottom w:w="100" w:type="dxa"/>
-              <w:left w:w="100" w:type="dxa"/>
-              <w:right w:w="100" w:type="dxa"/>
+              <w:top w:w="80" w:type="dxa"/>
+              <w:bottom w:w="80" w:type="dxa"/>
+              <w:left w:w="80" w:type="dxa"/>
+              <w:right w:w="80" w:type="dxa"/>
             </w:tcMar>
           </w:tcPr>
           <w:p>
@@ -396,7 +548,7 @@
               <w:rPr>
                 <w:b/>
                 <w:color w:val="FFFFFF"/>
-                <w:sz w:val="18"/>
+                <w:sz w:val="17"/>
               </w:rPr>
               <w:t>Proposition 3 : Dyadique</w:t>
             </w:r>
@@ -421,7 +573,7 @@
                 <w:b/>
                 <w:sz w:val="17"/>
               </w:rPr>
-              <w:t>Objectif Central</w:t>
+              <w:t>Objectif vulgarisé</w:t>
             </w:r>
           </w:p>
         </w:tc>
@@ -441,7 +593,7 @@
               <w:rPr>
                 <w:sz w:val="17"/>
               </w:rPr>
-              <w:t>Modéliser les marqueurs visuels de l'expertise en réception.</w:t>
+              <w:t>Comprendre ce qui sépare l'œil d'un débutant de celui d'un expert.</w:t>
             </w:r>
           </w:p>
         </w:tc>
@@ -461,7 +613,7 @@
               <w:rPr>
                 <w:sz w:val="17"/>
               </w:rPr>
-              <w:t>Mesurer l'impact pédagogique d'un entraînement 'Spotlight'.</w:t>
+              <w:t>Tester si apprendre avec des vidéos 'Spotlight' rend plus efficace.</w:t>
             </w:r>
           </w:p>
         </w:tc>
@@ -481,7 +633,7 @@
               <w:rPr>
                 <w:sz w:val="17"/>
               </w:rPr>
-              <w:t>Décortiquer la synchronie sociale et le vécu en interaction.</w:t>
+              <w:t>Comprendre ce qui se passe dans les yeux des deux interlocuteurs.</w:t>
             </w:r>
           </w:p>
         </w:tc>
@@ -504,7 +656,7 @@
                 <w:b/>
                 <w:sz w:val="17"/>
               </w:rPr>
-              <w:t>Design Expérimental</w:t>
+              <w:t>Design expérimental</w:t>
             </w:r>
           </w:p>
         </w:tc>
@@ -544,7 +696,7 @@
               <w:rPr>
                 <w:sz w:val="17"/>
               </w:rPr>
-              <w:t>RCT interventionnel pré-test / post-test randomisé.</w:t>
+              <w:t>Essai contrôlé randomisé (RCT) pré-test / post-test.</w:t>
             </w:r>
           </w:p>
         </w:tc>
@@ -587,7 +739,7 @@
                 <w:b/>
                 <w:sz w:val="17"/>
               </w:rPr>
-              <w:t>Matériel Oculométrique</w:t>
+              <w:t>Équipement requis</w:t>
             </w:r>
           </w:p>
         </w:tc>
@@ -647,7 +799,7 @@
               <w:rPr>
                 <w:sz w:val="17"/>
               </w:rPr>
-              <w:t>2 paires de lunettes Neon synchronisées (réceptionniste + client).</w:t>
+              <w:t>2 paires de lunettes Neon synchronisées en Wi-Fi NTP.</w:t>
             </w:r>
           </w:p>
         </w:tc>
@@ -670,7 +822,7 @@
                 <w:b/>
                 <w:sz w:val="17"/>
               </w:rPr>
-              <w:t>Références Clés</w:t>
+              <w:t>Références mobilisées</w:t>
             </w:r>
           </w:p>
         </w:tc>
@@ -753,7 +905,7 @@
                 <w:b/>
                 <w:sz w:val="17"/>
               </w:rPr>
-              <w:t>Livrable HECh</w:t>
+              <w:t>Livrable concret HECh</w:t>
             </w:r>
           </w:p>
         </w:tc>
@@ -773,7 +925,7 @@
               <w:rPr>
                 <w:sz w:val="17"/>
               </w:rPr>
-              <w:t>Référentiel métrologique des compétences visuelles pour évaluation.</w:t>
+              <w:t>Grille d'évaluation des compétences visuelles pour les examens.</w:t>
             </w:r>
           </w:p>
         </w:tc>
@@ -793,7 +945,7 @@
               <w:rPr>
                 <w:sz w:val="17"/>
               </w:rPr>
-              <w:t>Modules vidéo d'auto-formation par eye tracking prêts à l'emploi.</w:t>
+              <w:t>4 modules d'auto-formation vidéo 'Spotlight' sur Moodle.</w:t>
             </w:r>
           </w:p>
         </w:tc>
@@ -813,7 +965,7 @@
               <w:rPr>
                 <w:sz w:val="17"/>
               </w:rPr>
-              <w:t>Modèle d'ingénierie relationnelle pour la formation supérieure.</w:t>
+              <w:t>Guide méthodologique de débriefing réflexif pour formateurs.</w:t>
             </w:r>
           </w:p>
         </w:tc>
@@ -826,7 +978,7 @@
     </w:p>
     <w:p>
       <w:pPr>
-        <w:spacing w:before="240" w:after="120"/>
+        <w:spacing w:before="240" w:after="80"/>
       </w:pPr>
       <w:r>
         <w:rPr>
@@ -835,7 +987,7 @@
           <w:color w:val="1B365D"/>
           <w:sz w:val="30"/>
         </w:rPr>
-        <w:t>2. PROPOSITION 1 : Approche Comparativo-Développementale (Experts vs Novices)</w:t>
+        <w:t>2. PROPOSITION 1 : Approche Comparativo-Développementale (Novices vs Experts)</w:t>
       </w:r>
     </w:p>
     <w:p>
@@ -843,7 +995,7 @@
         <w:rPr>
           <w:i/>
         </w:rPr>
-        <w:t>Titre de recherche : « La Vision Professionnelle en Action : Étude comparative transversale de l'allocation attentionnelle, de la charge cognitive et de la performance relationnelle en accueil hôtelier instrumenté »</w:t>
+        <w:t>Intitulé vulgarisé : « Observer pour comprendre : Qu'est-ce qui différencie le regard d'un réceptionniste débutant de celui d'un professionnel expérimenté face à un client ? »</w:t>
       </w:r>
     </w:p>
     <w:p>
@@ -855,7 +1007,7 @@
           <w:b/>
           <w:color w:val="0E86D4"/>
         </w:rPr>
-        <w:t>2.1. Justification détaillée des choix scientifiques (Ancrage État de l'Art)</w:t>
+        <w:t>2.1. Justification théorique vulgarisée &amp; Ancrage dans l'état de l'art</w:t>
       </w:r>
     </w:p>
     <w:p>
@@ -863,7 +1015,17 @@
         <w:spacing w:line="276" w:lineRule="auto"/>
       </w:pPr>
       <w:r>
-        <w:t>Cette première méthodologie opérationnalise la méta-analyse de Gegenfurtner, Lehtinen et Säljö (2011) sur les lois universelles du regard expert : réduction de l'information (abandon des distracteurs), durées de fixation plus courtes et traitement parafovéal étendu. Elle intègre le cadre de complexité de Beckmann (2010) : la manipulation du PMS génère une forte charge cognitive extrinsèque chez l'étudiant novice. L'automatisation des routines informatiques chez le professionnel expérimenté libère des ressources en mémoire de travail, lui permettant d'orienter son attention vers le client. Cette proposition teste également le modèle de la vision professionnelle de Goodwin (1994) et de Wolff et al. (2016), la convergence prédictive de Cortina et al. (2015) et la stabilisation du Quiet Eye de Vickers (2016) avant l'annonce du tarif d'upselling (Denizci Guillet, 2020 ; Ruki, 2023).</w:t>
+        <w:t>Pourquoi comparer des étudiants débutants, des étudiants de fin de cursus et des professionnels en poste ?</w:t>
+        <w:br/>
+        <w:t>1. L'œil de l'expert va droit au but : Gegenfurtner et al. (2011) démontrent sur 73 études que les experts ne regardent pas 'plus' de choses, mais regardent mieux et plus vite. Le professionnel ignore les informations inutiles pour cibler immédiatement la case essentielle sur l'écran (hypothèse de réduction de l'information).</w:t>
+        <w:br/>
+        <w:t>2. Le logiciel monopolise l'esprit du débutant : Selon Beckmann (2010), le manque de familiarité avec un logiciel sature la mémoire de travail (charge extrinsèque). L'étudiant débutant n'a plus assez d'espace mental pour regarder le client. À l'inverse, chez l'expert, la manipulation du PMS est automatisée, libérant son regard pour la relation.</w:t>
+        <w:br/>
+        <w:t>3. La vision professionnelle : Goodwin (1994) et Wolff et al. (2016) prouvent que l'expertise confère une vision panoramique distribuée, détectant les indices critiques que le novice ignore.</w:t>
+        <w:br/>
+        <w:t>4. Le Quiet Eye : Vickers (2016) montre que les experts stabilisent leur regard (au moins 100 ms) juste avant une action décisive. Nous testons si cette pause oculaire stabilise la persuasion en upselling.</w:t>
+        <w:br/>
+        <w:t>5. Validation de la qualité relationnelle : Cortina et al. (2015) ont établi que les mesures d'eye tracking mobile convergent fidèlement avec les grilles d'évaluation de la qualité de service.</w:t>
       </w:r>
     </w:p>
     <w:p>
@@ -872,7 +1034,7 @@
           <w:b/>
           <w:color w:val="0E86D4"/>
         </w:rPr>
-        <w:t>2.2. Plan du projet de recherche (Phasage sur 12 mois)</w:t>
+        <w:t>2.2. Plan opérationnel du projet (Phasage sur 12 mois)</w:t>
       </w:r>
     </w:p>
     <w:p>
@@ -884,10 +1046,10 @@
         <w:rPr>
           <w:b/>
         </w:rPr>
-        <w:t xml:space="preserve">• Mois 1-2 (Cadrage &amp; Pilote) : </w:t>
+        <w:t xml:space="preserve">• Mois 1-2 (Cadrage &amp; Test Pilote) : </w:t>
       </w:r>
       <w:r>
-        <w:t>Scénarisation des micro-situations (Upselling &amp; Réclamation), paramétrage du PMS expérimental et calibration des AOI selon Hooge et al. (2024).</w:t>
+        <w:t>Scénarisation de 2 cas (Upselling multicanal selon Denizci Guillet, 2020 et Réclamation selon Ruki, 2023). Standardisation des comédiens jouant les clients. Calibrage des AOI écran et tablette selon Hooge et al. (2024).</w:t>
       </w:r>
     </w:p>
     <w:p>
@@ -899,10 +1061,10 @@
         <w:rPr>
           <w:b/>
         </w:rPr>
-        <w:t xml:space="preserve">• Mois 3-6 (Recueil Expérimental) : </w:t>
+        <w:t xml:space="preserve">• Mois 3-5 (Recueil sur 60 participants) : </w:t>
       </w:r>
       <w:r>
-        <w:t>Passation de 60 participants sous lunettes Neon 200 Hz (20 Novices B1, 20 Intermédiaires B3, 20 Professionnels 4*-5*).</w:t>
+        <w:t>Passation de 60 sujets équipés des lunettes Neon (20 Novices B1, 20 Intermédiaires B3, 20 Professionnels 4*-5*). Session de 35 minutes par sujet : accueil, 2 simulations enregistrées (yeux 200 Hz, vidéo HD, audio, logs) et questionnaire d'effort mental.</w:t>
       </w:r>
     </w:p>
     <w:p>
@@ -914,10 +1076,10 @@
         <w:rPr>
           <w:b/>
         </w:rPr>
-        <w:t xml:space="preserve">• Mois 7-8 (Traitement &amp; IA) : </w:t>
+        <w:t xml:space="preserve">• Mois 6-8 (Traitement &amp; Vision par ordinateur) : </w:t>
       </w:r>
       <w:r>
-        <w:t>Extraction automatisée des fixations via le pipeline de vision par ordinateur de De Beugher et al. (2014) et double codage en aveugle de la qualité d'accueil.</w:t>
+        <w:t>Détection semi-automatique des AOI écran, tablette et visage client par le pipeline IA de De Beugher et al. (2014). Double codage en aveugle de la qualité relationnelle par des enseignants (grille CLASS).</w:t>
       </w:r>
     </w:p>
     <w:p>
@@ -929,10 +1091,10 @@
         <w:rPr>
           <w:b/>
         </w:rPr>
-        <w:t xml:space="preserve">• Mois 9-12 (Analyses &amp; Valorisation) : </w:t>
+        <w:t xml:space="preserve">• Mois 9-12 (Analyses statistiques &amp; Livrables) : </w:t>
       </w:r>
       <w:r>
-        <w:t>Analyses ANOVA/MANOVA, modélisation de l'expertise, rédaction du référentiel pour l'HECh et soumission d'article scientifique.</w:t>
+        <w:t>Analyses ANOVA à mesures répétées, formalisation du 'Guide des Bonnes Pratiques Visuelles en Réception' pour l'HECh et soumission d'article scientifique.</w:t>
       </w:r>
     </w:p>
     <w:p>
@@ -944,7 +1106,7 @@
           <w:b/>
           <w:color w:val="0E86D4"/>
         </w:rPr>
-        <w:t>2.3. Grille des indicateurs opérationnels (Proposition 1)</w:t>
+        <w:t>2.3. Grille complète des indicateurs opérationnels (Proposition 1)</w:t>
       </w:r>
     </w:p>
     <w:tbl>
@@ -978,7 +1140,7 @@
                 <w:color w:val="FFFFFF"/>
                 <w:sz w:val="17"/>
               </w:rPr>
-              <w:t>Indicateur</w:t>
+              <w:t>Indicateur vulgarisé</w:t>
             </w:r>
           </w:p>
         </w:tc>
@@ -1000,7 +1162,7 @@
                 <w:color w:val="FFFFFF"/>
                 <w:sz w:val="17"/>
               </w:rPr>
-              <w:t>Métrique &amp; Calcul</w:t>
+              <w:t>Mode de calcul</w:t>
             </w:r>
           </w:p>
         </w:tc>
@@ -1022,7 +1184,7 @@
                 <w:color w:val="FFFFFF"/>
                 <w:sz w:val="17"/>
               </w:rPr>
-              <w:t>Outil de Recueil</w:t>
+              <w:t>Signification pour la recherche</w:t>
             </w:r>
           </w:p>
         </w:tc>
@@ -1044,7 +1206,7 @@
                 <w:color w:val="FFFFFF"/>
                 <w:sz w:val="17"/>
               </w:rPr>
-              <w:t>Justification État de l'Art</w:t>
+              <w:t>Ancrage État de l'Art</w:t>
             </w:r>
           </w:p>
         </w:tc>
@@ -1066,7 +1228,7 @@
               <w:rPr>
                 <w:sz w:val="16"/>
               </w:rPr>
-              <w:t>Dwell Time PMS (%)</w:t>
+              <w:t>Temps passé sur l'écran (%)</w:t>
             </w:r>
           </w:p>
         </w:tc>
@@ -1086,7 +1248,7 @@
               <w:rPr>
                 <w:sz w:val="16"/>
               </w:rPr>
-              <w:t>Pourcentage du temps total passé à fixer l'interface logicielle.</w:t>
+              <w:t>(Temps fixation écran / Durée totale) * 100.</w:t>
             </w:r>
           </w:p>
         </w:tc>
@@ -1106,7 +1268,7 @@
               <w:rPr>
                 <w:sz w:val="16"/>
               </w:rPr>
-              <w:t>Pupil Labs Neon (Surface AOI)</w:t>
+              <w:t>Mesure si l'opérateur est prisonnier de son outil informatique.</w:t>
             </w:r>
           </w:p>
         </w:tc>
@@ -1126,7 +1288,7 @@
               <w:rPr>
                 <w:sz w:val="16"/>
               </w:rPr>
-              <w:t>Beckmann (2010) : Charge extrinsèque liée au manque d'automatisation.</w:t>
+              <w:t>Beckmann (2010) (Charge extrinsèque)</w:t>
             </w:r>
           </w:p>
         </w:tc>
@@ -1148,7 +1310,7 @@
               <w:rPr>
                 <w:sz w:val="16"/>
               </w:rPr>
-              <w:t>TTFF - Champ Tarifaire</w:t>
+              <w:t>Temps pour trouver l'info clé (ms)</w:t>
             </w:r>
           </w:p>
         </w:tc>
@@ -1168,7 +1330,7 @@
               <w:rPr>
                 <w:sz w:val="16"/>
               </w:rPr>
-              <w:t>Latence (ms) jusqu'à la 1re fixation sur le champ tarifaire / surclassement.</w:t>
+              <w:t>Chronomètre jusqu'à la 1re fixation sur le statut de chambre.</w:t>
             </w:r>
           </w:p>
         </w:tc>
@@ -1188,7 +1350,7 @@
               <w:rPr>
                 <w:sz w:val="16"/>
               </w:rPr>
-              <w:t>Neon (AOI Statique PMS)</w:t>
+              <w:t>Prouve si l'opérateur sait où regarder sans hésiter.</w:t>
             </w:r>
           </w:p>
         </w:tc>
@@ -1208,7 +1370,7 @@
               <w:rPr>
                 <w:sz w:val="16"/>
               </w:rPr>
-              <w:t>Gegenfurtner et al. (2011) : Accès parafovéal plus rapide chez l'expert.</w:t>
+              <w:t>Gegenfurtner et al. (2011) (Modèle holistique)</w:t>
             </w:r>
           </w:p>
         </w:tc>
@@ -1230,7 +1392,7 @@
               <w:rPr>
                 <w:sz w:val="16"/>
               </w:rPr>
-              <w:t>Ratio Regard Client / PMS</w:t>
+              <w:t>Ratio Visage / Écran</w:t>
             </w:r>
           </w:p>
         </w:tc>
@@ -1250,7 +1412,7 @@
               <w:rPr>
                 <w:sz w:val="16"/>
               </w:rPr>
-              <w:t>Temps de fixation Visage Client / Temps de fixation Écran PMS.</w:t>
+              <w:t>Temps regard client / Temps regard écran.</w:t>
             </w:r>
           </w:p>
         </w:tc>
@@ -1270,7 +1432,7 @@
               <w:rPr>
                 <w:sz w:val="16"/>
               </w:rPr>
-              <w:t>Calcul automatique coordonnées</w:t>
+              <w:t>Ratio &lt; 0.5 = communication rompue ; &gt; 1.2 = relation prépondérante.</w:t>
             </w:r>
           </w:p>
         </w:tc>
@@ -1290,7 +1452,7 @@
               <w:rPr>
                 <w:sz w:val="16"/>
               </w:rPr>
-              <w:t>Wolff et al. (2016) : Mesure de la vision panoramique vs cécité écran.</w:t>
+              <w:t>Wolff et al. (2016) (Vision distribuée)</w:t>
             </w:r>
           </w:p>
         </w:tc>
@@ -1312,7 +1474,7 @@
               <w:rPr>
                 <w:sz w:val="16"/>
               </w:rPr>
-              <w:t>Quiet Eye Duration (QED)</w:t>
+              <w:t>Regard fixe avant parole (Quiet Eye)</w:t>
             </w:r>
           </w:p>
         </w:tc>
@@ -1332,7 +1494,7 @@
               <w:rPr>
                 <w:sz w:val="16"/>
               </w:rPr>
-              <w:t>Durée (ms) de la dernière fixation stable avant la prise de parole critique.</w:t>
+              <w:t>Durée (ms) de la fixation stable juste avant d'annoncer l'offre.</w:t>
             </w:r>
           </w:p>
         </w:tc>
@@ -1352,7 +1514,7 @@
               <w:rPr>
                 <w:sz w:val="16"/>
               </w:rPr>
-              <w:t>Microphone + Neon</w:t>
+              <w:t>Indique le temps de préparation mentale et de contrôle émotionnel.</w:t>
             </w:r>
           </w:p>
         </w:tc>
@@ -1372,7 +1534,7 @@
               <w:rPr>
                 <w:sz w:val="16"/>
               </w:rPr>
-              <w:t>Vickers (2016) : Programmation cognitive et motrice optimale.</w:t>
+              <w:t>Vickers (2016) (Quiet Eye)</w:t>
             </w:r>
           </w:p>
         </w:tc>
@@ -1394,7 +1556,7 @@
               <w:rPr>
                 <w:sz w:val="16"/>
               </w:rPr>
-              <w:t>Score de Rapport Non Verbal</w:t>
+              <w:t>Fréquence des sourires sincères</w:t>
             </w:r>
           </w:p>
         </w:tc>
@@ -1414,7 +1576,7 @@
               <w:rPr>
                 <w:sz w:val="16"/>
               </w:rPr>
-              <w:t>Score composite sur 7 points (attention mutuelle, positivité, coordination).</w:t>
+              <w:t>Nombre de sourires authentiques (Duchenne) relevés sur la vidéo.</w:t>
             </w:r>
           </w:p>
         </w:tc>
@@ -1434,7 +1596,7 @@
               <w:rPr>
                 <w:sz w:val="16"/>
               </w:rPr>
-              <w:t>Grille CLASS (Cortina 2015)</w:t>
+              <w:t>Différencie la chaleur naturelle du simple masque commercial forcé.</w:t>
             </w:r>
           </w:p>
         </w:tc>
@@ -1454,7 +1616,89 @@
               <w:rPr>
                 <w:sz w:val="16"/>
               </w:rPr>
-              <w:t>Tickle-Degnen (1990) &amp; Cortina (2015) : Validation par convergence.</w:t>
+              <w:t>Hennig-Thurau et al. (2006) (Travail émotionnel)</w:t>
+            </w:r>
+          </w:p>
+        </w:tc>
+      </w:tr>
+      <w:tr>
+        <w:tc>
+          <w:tcPr>
+            <w:tcW w:type="dxa" w:w="2340"/>
+            <w:shd w:val="clear" w:color="auto" w:fill="F9FAFC"/>
+            <w:tcMar>
+              <w:top w:w="50" w:type="dxa"/>
+              <w:bottom w:w="50" w:type="dxa"/>
+              <w:left w:w="60" w:type="dxa"/>
+              <w:right w:w="60" w:type="dxa"/>
+            </w:tcMar>
+          </w:tcPr>
+          <w:p>
+            <w:r>
+              <w:rPr>
+                <w:sz w:val="16"/>
+              </w:rPr>
+              <w:t>Taux de succès de l'upselling</w:t>
+            </w:r>
+          </w:p>
+        </w:tc>
+        <w:tc>
+          <w:tcPr>
+            <w:tcW w:type="dxa" w:w="2340"/>
+            <w:shd w:val="clear" w:color="auto" w:fill="F9FAFC"/>
+            <w:tcMar>
+              <w:top w:w="50" w:type="dxa"/>
+              <w:bottom w:w="50" w:type="dxa"/>
+              <w:left w:w="60" w:type="dxa"/>
+              <w:right w:w="60" w:type="dxa"/>
+            </w:tcMar>
+          </w:tcPr>
+          <w:p>
+            <w:r>
+              <w:rPr>
+                <w:sz w:val="16"/>
+              </w:rPr>
+              <w:t>Résultat binaire (Surclassement accepté : Oui / Non) et montant.</w:t>
+            </w:r>
+          </w:p>
+        </w:tc>
+        <w:tc>
+          <w:tcPr>
+            <w:tcW w:type="dxa" w:w="2340"/>
+            <w:shd w:val="clear" w:color="auto" w:fill="F9FAFC"/>
+            <w:tcMar>
+              <w:top w:w="50" w:type="dxa"/>
+              <w:bottom w:w="50" w:type="dxa"/>
+              <w:left w:w="60" w:type="dxa"/>
+              <w:right w:w="60" w:type="dxa"/>
+            </w:tcMar>
+          </w:tcPr>
+          <w:p>
+            <w:r>
+              <w:rPr>
+                <w:sz w:val="16"/>
+              </w:rPr>
+              <w:t>Mesure la performance commerciale concrète de l'interaction.</w:t>
+            </w:r>
+          </w:p>
+        </w:tc>
+        <w:tc>
+          <w:tcPr>
+            <w:tcW w:type="dxa" w:w="2340"/>
+            <w:shd w:val="clear" w:color="auto" w:fill="F9FAFC"/>
+            <w:tcMar>
+              <w:top w:w="50" w:type="dxa"/>
+              <w:bottom w:w="50" w:type="dxa"/>
+              <w:left w:w="60" w:type="dxa"/>
+              <w:right w:w="60" w:type="dxa"/>
+            </w:tcMar>
+          </w:tcPr>
+          <w:p>
+            <w:r>
+              <w:rPr>
+                <w:sz w:val="16"/>
+              </w:rPr>
+              <w:t>Denizci Guillet (2020) &amp; Ruki (2023)</w:t>
             </w:r>
           </w:p>
         </w:tc>
@@ -1467,7 +1711,7 @@
     </w:p>
     <w:p>
       <w:pPr>
-        <w:spacing w:before="240" w:after="120"/>
+        <w:spacing w:before="240" w:after="80"/>
       </w:pPr>
       <w:r>
         <w:rPr>
@@ -1484,7 +1728,7 @@
         <w:rPr>
           <w:i/>
         </w:rPr>
-        <w:t>Titre de recherche : « Ingénierie Pédagogique par Modélisation du Regard (EMME) : Évaluation de l'impact d'un guidage attentionnel 'Spotlight' sur l'apprentissage des compétences d'accueil hôtelier »</w:t>
+        <w:t>Intitulé vulgarisé : « Apprendre à travers les yeux d'un expert : Des capsules vidéo montrant le regard d'un professionnel permettent-elles aux étudiants de mieux réussir l'accueil ? »</w:t>
       </w:r>
     </w:p>
     <w:p>
@@ -1496,7 +1740,7 @@
           <w:b/>
           <w:color w:val="0E86D4"/>
         </w:rPr>
-        <w:t>3.1. Justification détaillée des choix scientifiques (Ancrage État de l'Art)</w:t>
+        <w:t>3.1. Justification théorique vulgarisée &amp; Ancrage dans l'état de l'art</w:t>
       </w:r>
     </w:p>
     <w:p>
@@ -1504,7 +1748,15 @@
         <w:spacing w:line="276" w:lineRule="auto"/>
       </w:pPr>
       <w:r>
-        <w:t>Cette méthodologie interventionnelle s'appuie directement sur les travaux de Jarodzka et al. (2012) et de Seppänen &amp; Gegenfurtner (2012). Elle répond à la mise en garde de Van Gog et al. (2009) en évitant les cercles oculaires distrayants au profit de la technique du 'Spotlight' (zone fixée nette, environnement périphérique estompé). L'apprentissage par observation des saccades expertes permet aux étudiants d'assimiler l'organisation visuelle du check-in sans surcharge cognitive. L'analyse des silences d'Elling, Lentz et de Jong (2012) est mobilisée pour mesurer l'allègement de la charge cognitive lors du post-test.</w:t>
+        <w:t>Pourquoi utiliser des vidéos enrichies du regard de l'expert pour former les étudiants ?</w:t>
+        <w:br/>
+        <w:t>1. Rendre visible l'invisible sans distraire : Jarodzka et al. (2012) démontrent qu'un simple cercle rouge sur une vidéo distrait l'apprenant. En revanche, la technique du 'Spotlight' (zone regardée nette, environnement périphérique estompé à 40%) guide doucement l'attention sans détruire la vue d'ensemble.</w:t>
+        <w:br/>
+        <w:t>2. Accélérer l'apprentissage visuel : Seppänen &amp; Gegenfurtner (2012) confirment qu'observer le parcours oculaire d'un enseignant chevronné aide les étudiants à adopter un balayage méthodique.</w:t>
+        <w:br/>
+        <w:t>3. Éviter le piège de la redondance : Van Gog et al. (2009) ont prouvé que cumuler une trace visuelle avec de longs discours audio sature la mémoire de travail. Les capsules doivent donc être très courtes (2 min 30) et ciblées sur des gestes professionnels précis.</w:t>
+        <w:br/>
+        <w:t>4. Les silences comme révélateur didactique : Elling et al. (2012) révèlent que les silences face à l'écran (27% du temps) traduisent souvent une surcharge cognitive. L'efficacité de la formation se mesurera par la réduction des silences de blocage face au client.</w:t>
       </w:r>
     </w:p>
     <w:p>
@@ -1513,7 +1765,7 @@
           <w:b/>
           <w:color w:val="0E86D4"/>
         </w:rPr>
-        <w:t>3.2. Plan du projet de recherche (Phasage sur 10 mois)</w:t>
+        <w:t>3.2. Plan opérationnel du projet (Phasage sur 10 mois)</w:t>
       </w:r>
     </w:p>
     <w:p>
@@ -1525,10 +1777,10 @@
         <w:rPr>
           <w:b/>
         </w:rPr>
-        <w:t xml:space="preserve">• Mois 1-3 (Production Didactique) : </w:t>
+        <w:t xml:space="preserve">• Mois 1-3 (Production des capsules) : </w:t>
       </w:r>
       <w:r>
-        <w:t>Tournage des 4 scénarios experts sous lunettes Neon et développement algorithmique du filtre vidéo Spotlight (FFmpeg/Python).</w:t>
+        <w:t>Tournage de 4 cas modèles sous lunettes Neon avec un chef de réception confirmé. Développement informatique du filtre vidéo Spotlight (Python/FFmpeg). Scénarisation de capsules de 2 min 30 avec voix off sobre.</w:t>
       </w:r>
     </w:p>
     <w:p>
@@ -1540,10 +1792,10 @@
         <w:rPr>
           <w:b/>
         </w:rPr>
-        <w:t xml:space="preserve">• Mois 4-6 (Essai Randomisé RCT) : </w:t>
+        <w:t xml:space="preserve">• Mois 4-6 (Essai comparatif randomisé RCT) : </w:t>
       </w:r>
       <w:r>
-        <w:t>Passation du pré-test T0 (50 étudiants sous Neon), intervention didactique (Bras EMME Spotlight vs Bras Contrôle classique), puis post-test T1.</w:t>
+        <w:t>50 étudiants de Bachelier en Gestion Hôtelière répartis par tirage au sort (25 en Groupe Expérimental Spotlight vs 25 en Groupe Contrôle classique). Protocole : Pré-test T0 (simulation sous Neon) -&gt; 3 semaines d'apprentissage -&gt; Post-test T1 (nouvelle simulation sous Neon).</w:t>
       </w:r>
     </w:p>
     <w:p>
@@ -1555,10 +1807,10 @@
         <w:rPr>
           <w:b/>
         </w:rPr>
-        <w:t xml:space="preserve">• Mois 7-8 (Traitement &amp; Métriques) : </w:t>
+        <w:t xml:space="preserve">• Mois 7-8 (Traitement des gains &amp; silences) : </w:t>
       </w:r>
       <w:r>
-        <w:t>Calcul automatisé des deltas de progression Delta(T1 - T0) et analyse de la réduction des silences non résolus face au client.</w:t>
+        <w:t>Calcul des deltas de progression Delta(T1 - T0). Analyse chronométrique des silences de blocage (&gt; 2 s) selon Elling et al. (2012) et mesure de l'effort mental sur l'échelle de Paas.</w:t>
       </w:r>
     </w:p>
     <w:p>
@@ -1570,10 +1822,10 @@
         <w:rPr>
           <w:b/>
         </w:rPr>
-        <w:t xml:space="preserve">• Mois 9-10 (Transfert Curriculaire) : </w:t>
+        <w:t xml:space="preserve">• Mois 9-10 (Déploiement curriculaire HECh) : </w:t>
       </w:r>
       <w:r>
-        <w:t>Mesure de la charge mentale subjective (échelle de Paas) et intégration pérenne des capsules vidéo dans Moodle HECh/HEL.</w:t>
+        <w:t>Mise à disposition pérenne des capsules sur Moodle HECh/HEL et journée de dissémination pédagogique pour les formateurs.</w:t>
       </w:r>
     </w:p>
     <w:p>
@@ -1585,7 +1837,7 @@
           <w:b/>
           <w:color w:val="0E86D4"/>
         </w:rPr>
-        <w:t>3.3. Grille des indicateurs opérationnels (Proposition 2)</w:t>
+        <w:t>3.3. Grille complète des indicateurs opérationnels (Proposition 2)</w:t>
       </w:r>
     </w:p>
     <w:tbl>
@@ -1619,7 +1871,7 @@
                 <w:color w:val="FFFFFF"/>
                 <w:sz w:val="17"/>
               </w:rPr>
-              <w:t>Indicateur</w:t>
+              <w:t>Indicateur vulgarisé</w:t>
             </w:r>
           </w:p>
         </w:tc>
@@ -1641,7 +1893,7 @@
                 <w:color w:val="FFFFFF"/>
                 <w:sz w:val="17"/>
               </w:rPr>
-              <w:t>Métrique &amp; Calcul</w:t>
+              <w:t>Mode de calcul</w:t>
             </w:r>
           </w:p>
         </w:tc>
@@ -1663,7 +1915,7 @@
                 <w:color w:val="FFFFFF"/>
                 <w:sz w:val="17"/>
               </w:rPr>
-              <w:t>Outil de Recueil</w:t>
+              <w:t>Signification pour la recherche</w:t>
             </w:r>
           </w:p>
         </w:tc>
@@ -1685,7 +1937,7 @@
                 <w:color w:val="FFFFFF"/>
                 <w:sz w:val="17"/>
               </w:rPr>
-              <w:t>Justification État de l'Art</w:t>
+              <w:t>Ancrage État de l'Art</w:t>
             </w:r>
           </w:p>
         </w:tc>
@@ -1707,7 +1959,7 @@
               <w:rPr>
                 <w:sz w:val="16"/>
               </w:rPr>
-              <w:t>Gain Attentionnel Client</w:t>
+              <w:t>Gain d'attention client (Delta RC)</w:t>
             </w:r>
           </w:p>
         </w:tc>
@@ -1727,7 +1979,7 @@
               <w:rPr>
                 <w:sz w:val="16"/>
               </w:rPr>
-              <w:t>Progression du % temps regard dirigé vers le client : Delta = T1 - T0.</w:t>
+              <w:t>% Temps regard client en T1 moins % en T0.</w:t>
             </w:r>
           </w:p>
         </w:tc>
@@ -1747,7 +1999,7 @@
               <w:rPr>
                 <w:sz w:val="16"/>
               </w:rPr>
-              <w:t>Neon (AOI Visage Client)</w:t>
+              <w:t>Valide que l'étudiant ose lever les yeux de son écran vers le client.</w:t>
             </w:r>
           </w:p>
         </w:tc>
@@ -1767,7 +2019,7 @@
               <w:rPr>
                 <w:sz w:val="16"/>
               </w:rPr>
-              <w:t>Jarodzka et al. (2012) : Transfert réussi du balayage visuel.</w:t>
+              <w:t>Jarodzka et al. (2012) (Guidage Spotlight)</w:t>
             </w:r>
           </w:p>
         </w:tc>
@@ -1789,7 +2041,7 @@
               <w:rPr>
                 <w:sz w:val="16"/>
               </w:rPr>
-              <w:t>Réduction Errance PMS</w:t>
+              <w:t>Gain de fluidité logicielle (Delta EP)</w:t>
             </w:r>
           </w:p>
         </w:tc>
@@ -1809,7 +2061,7 @@
               <w:rPr>
                 <w:sz w:val="16"/>
               </w:rPr>
-              <w:t>Diminution du temps d'errance sur les menus PMS : Delta = T0 - T1.</w:t>
+              <w:t>Temps perdu à chercher sur le PMS en T0 moins ce temps en T1.</w:t>
             </w:r>
           </w:p>
         </w:tc>
@@ -1829,7 +2081,7 @@
               <w:rPr>
                 <w:sz w:val="16"/>
               </w:rPr>
-              <w:t>Neon (AOI Interface PMS)</w:t>
+              <w:t>Démontre que la modélisation a transmis la trajectoire visuelle experte.</w:t>
             </w:r>
           </w:p>
         </w:tc>
@@ -1849,7 +2101,7 @@
               <w:rPr>
                 <w:sz w:val="16"/>
               </w:rPr>
-              <w:t>Seppänen &amp; Gegenfurtner (2012) : Élimination des fixations parasites.</w:t>
+              <w:t>Seppänen &amp; Gegenfurtner (2012) (Modélisation)</w:t>
             </w:r>
           </w:p>
         </w:tc>
@@ -1871,7 +2123,7 @@
               <w:rPr>
                 <w:sz w:val="16"/>
               </w:rPr>
-              <w:t>Silences Non Résolus</w:t>
+              <w:t>Baisse des silences bloquants</w:t>
             </w:r>
           </w:p>
         </w:tc>
@@ -1891,7 +2143,7 @@
               <w:rPr>
                 <w:sz w:val="16"/>
               </w:rPr>
-              <w:t>Durée cumulée (s) des pauses verbales &gt; 2s avec regard bloqué sur l'écran.</w:t>
+              <w:t>Durée cumulée des silences &gt; 2 s avec regard figé sur l'ordinateur.</w:t>
             </w:r>
           </w:p>
         </w:tc>
@@ -1911,7 +2163,7 @@
               <w:rPr>
                 <w:sz w:val="16"/>
               </w:rPr>
-              <w:t>Audio + Oculométrie</w:t>
+              <w:t>Prouve que l'étudiant ne subit plus de surcharge mentale bloquante.</w:t>
             </w:r>
           </w:p>
         </w:tc>
@@ -1931,7 +2183,7 @@
               <w:rPr>
                 <w:sz w:val="16"/>
               </w:rPr>
-              <w:t>Elling et al. (2012) : Révélateur direct de saturation cognitive.</w:t>
+              <w:t>Elling et al. (2012) (Traitement des silences)</w:t>
             </w:r>
           </w:p>
         </w:tc>
@@ -1953,7 +2205,7 @@
               <w:rPr>
                 <w:sz w:val="16"/>
               </w:rPr>
-              <w:t>Score d'Effort Mental</w:t>
+              <w:t>Score d'allègement mental</w:t>
             </w:r>
           </w:p>
         </w:tc>
@@ -1973,7 +2225,7 @@
               <w:rPr>
                 <w:sz w:val="16"/>
               </w:rPr>
-              <w:t>Évaluation psychométrique de la charge ressentie sur l'échelle de Paas (1 à 9).</w:t>
+              <w:t>Différence de note sur l'échelle de Paas (1 à 9 points).</w:t>
             </w:r>
           </w:p>
         </w:tc>
@@ -1993,7 +2245,7 @@
               <w:rPr>
                 <w:sz w:val="16"/>
               </w:rPr>
-              <w:t>Questionnaire post-tâche</w:t>
+              <w:t>Confirme que le dispositif a rendu l'activité plus fluide et moins stressante.</w:t>
             </w:r>
           </w:p>
         </w:tc>
@@ -2013,7 +2265,7 @@
               <w:rPr>
                 <w:sz w:val="16"/>
               </w:rPr>
-              <w:t>Beckmann (2010) : Diminution de la charge extrinsèque.</w:t>
+              <w:t>Van Gog et al. (2009) &amp; Beckmann (2010)</w:t>
             </w:r>
           </w:p>
         </w:tc>
@@ -2035,7 +2287,7 @@
               <w:rPr>
                 <w:sz w:val="16"/>
               </w:rPr>
-              <w:t>Qualité de l'Upselling</w:t>
+              <w:t>Score de persuasion en upselling</w:t>
             </w:r>
           </w:p>
         </w:tc>
@@ -2055,7 +2307,7 @@
               <w:rPr>
                 <w:sz w:val="16"/>
               </w:rPr>
-              <w:t>Grille critériée sur 20 points (conformité tarifaire, élocution, persuasion).</w:t>
+              <w:t>Grille sur 20 points évaluant la mise en valeur des bénéfices chambre.</w:t>
             </w:r>
           </w:p>
         </w:tc>
@@ -2075,7 +2327,7 @@
               <w:rPr>
                 <w:sz w:val="16"/>
               </w:rPr>
-              <w:t>Grille d'examen HECh</w:t>
+              <w:t>Mesure la conversion concrète de l'aisance visuelle en succès commercial.</w:t>
             </w:r>
           </w:p>
         </w:tc>
@@ -2095,7 +2347,89 @@
               <w:rPr>
                 <w:sz w:val="16"/>
               </w:rPr>
-              <w:t>Ruki (2023) : Maîtrise des produits et aisance commerciale.</w:t>
+              <w:t>Ruki (2023) &amp; Otterbring et al. (2014)</w:t>
+            </w:r>
+          </w:p>
+        </w:tc>
+      </w:tr>
+      <w:tr>
+        <w:tc>
+          <w:tcPr>
+            <w:tcW w:type="dxa" w:w="2340"/>
+            <w:shd w:val="clear" w:color="auto" w:fill="F9FAFC"/>
+            <w:tcMar>
+              <w:top w:w="50" w:type="dxa"/>
+              <w:bottom w:w="50" w:type="dxa"/>
+              <w:left w:w="60" w:type="dxa"/>
+              <w:right w:w="60" w:type="dxa"/>
+            </w:tcMar>
+          </w:tcPr>
+          <w:p>
+            <w:r>
+              <w:rPr>
+                <w:sz w:val="16"/>
+              </w:rPr>
+              <w:t>Score d'écoute (Réclamation)</w:t>
+            </w:r>
+          </w:p>
+        </w:tc>
+        <w:tc>
+          <w:tcPr>
+            <w:tcW w:type="dxa" w:w="2340"/>
+            <w:shd w:val="clear" w:color="auto" w:fill="F9FAFC"/>
+            <w:tcMar>
+              <w:top w:w="50" w:type="dxa"/>
+              <w:bottom w:w="50" w:type="dxa"/>
+              <w:left w:w="60" w:type="dxa"/>
+              <w:right w:w="60" w:type="dxa"/>
+            </w:tcMar>
+          </w:tcPr>
+          <w:p>
+            <w:r>
+              <w:rPr>
+                <w:sz w:val="16"/>
+              </w:rPr>
+              <w:t>Note sur 20 portant sur l'attitude calme et l'absence de coupure de parole.</w:t>
+            </w:r>
+          </w:p>
+        </w:tc>
+        <w:tc>
+          <w:tcPr>
+            <w:tcW w:type="dxa" w:w="2340"/>
+            <w:shd w:val="clear" w:color="auto" w:fill="F9FAFC"/>
+            <w:tcMar>
+              <w:top w:w="50" w:type="dxa"/>
+              <w:bottom w:w="50" w:type="dxa"/>
+              <w:left w:w="60" w:type="dxa"/>
+              <w:right w:w="60" w:type="dxa"/>
+            </w:tcMar>
+          </w:tcPr>
+          <w:p>
+            <w:r>
+              <w:rPr>
+                <w:sz w:val="16"/>
+              </w:rPr>
+              <w:t>Démontre la capacité à gérer l'incident sans se cacher derrière l'écran.</w:t>
+            </w:r>
+          </w:p>
+        </w:tc>
+        <w:tc>
+          <w:tcPr>
+            <w:tcW w:type="dxa" w:w="2340"/>
+            <w:shd w:val="clear" w:color="auto" w:fill="F9FAFC"/>
+            <w:tcMar>
+              <w:top w:w="50" w:type="dxa"/>
+              <w:bottom w:w="50" w:type="dxa"/>
+              <w:left w:w="60" w:type="dxa"/>
+              <w:right w:w="60" w:type="dxa"/>
+            </w:tcMar>
+          </w:tcPr>
+          <w:p>
+            <w:r>
+              <w:rPr>
+                <w:sz w:val="16"/>
+              </w:rPr>
+              <w:t>Tickle-Degnen &amp; Rosenthal (1990)</w:t>
             </w:r>
           </w:p>
         </w:tc>
@@ -2108,7 +2442,7 @@
     </w:p>
     <w:p>
       <w:pPr>
-        <w:spacing w:before="240" w:after="120"/>
+        <w:spacing w:before="240" w:after="80"/>
       </w:pPr>
       <w:r>
         <w:rPr>
@@ -2125,7 +2459,7 @@
         <w:rPr>
           <w:i/>
         </w:rPr>
-        <w:t>Titre de recherche : « Énaction et Synchronie Sociale : Analyse dyadique de l'interaction d'accueil hôtelier par double oculométrie mobile synchronisée et entretiens d'autoconfrontation du cours d'action »</w:t>
+        <w:t>Intitulé vulgarisé : « Se regarder, se comprendre, s'écouter : Que se passe-t-il vraiment dans les yeux et dans la tête du réceptionniste et du client pendant qu'ils se parlent ? »</w:t>
       </w:r>
     </w:p>
     <w:p>
@@ -2137,7 +2471,7 @@
           <w:b/>
           <w:color w:val="0E86D4"/>
         </w:rPr>
-        <w:t>4.1. Justification détaillée des choix scientifiques (Ancrage État de l'Art)</w:t>
+        <w:t>4.1. Justification théorique vulgarisée &amp; Ancrage dans l'état de l'art</w:t>
       </w:r>
     </w:p>
     <w:p>
@@ -2145,7 +2479,17 @@
         <w:spacing w:line="276" w:lineRule="auto"/>
       </w:pPr>
       <w:r>
-        <w:t>Cette proposition de pointe dépasse l'analyse unilatérale en équipant simultanément le réceptionniste et le client de lunettes Neon. Elle s'ancre dans les découvertes de Rogers et al. (2018) sur les dynamiques du regard social face-à-face et de Wohltjen &amp; Wheatley (2021) sur les cycles d'attention partagée et de désynchronisation salutaire. Sur le plan qualitatif, elle mobilise le cadre du cours d'action de Theureau (Durand, 2016) et la Cognitive Task Analysis de Crandall, Klein et Hoffman (2006). L'entretien d'autoconfrontation immédiat permet à l'étudiant d'expliciter son vécu subjectif, ses dilemmes et ses intentions lors des moments de tension.</w:t>
+        <w:t>Pourquoi équiper le client ET le réceptionniste de lunettes en même temps, puis faire un débriefing d'autoconfrontation ?</w:t>
+        <w:br/>
+        <w:t>1. La communication est une danse à deux : Rogers et al. (2018) prouvent en dual eye tracking que les interlocuteurs ne se regardent pas dans les yeux en continu. L'aversion visuelle est normale pour réfléchir ; l'enjeu est de savoir quand rétablir le contact.</w:t>
+        <w:br/>
+        <w:t>2. Le rythme de l'attention partagée : Wohltjen &amp; Wheatley (2021) révèlent dans PNAS que le contact oculaire marque le sommet de la connexion, suivi immédiatement d'une rupture salutaire pour permettre à chacun de penser. Alterner entre le client et la tablette d'upselling est la respiration naturelle de l'échange.</w:t>
+        <w:br/>
+        <w:t>3. Le rapport interpersonnel synchronisé : Tickle-Degnen &amp; Rosenthal (1990) fondent le rapport sur l'attention mutuelle et la coordination. Deux paires de lunettes mesurent si le client et le réceptionniste regardent la tablette au même moment.</w:t>
+        <w:br/>
+        <w:t>4. Comprendre le vécu intérieur (Cours d'action) : Theureau / Durand (2016) développent l'autoconfrontation : revoir sa vidéo oculaire permet à l'étudiant d'expliciter ce qu'il ressentait.</w:t>
+        <w:br/>
+        <w:t>5. Faire émerger les intuitions cachées : La méthode CDM de Crandall, Klein &amp; Hoffman (2006) fait verbaliser les dilemmes inconscients face aux tensions du client.</w:t>
       </w:r>
     </w:p>
     <w:p>
@@ -2154,7 +2498,7 @@
           <w:b/>
           <w:color w:val="0E86D4"/>
         </w:rPr>
-        <w:t>4.2. Plan du projet de recherche (Phasage sur 12 mois)</w:t>
+        <w:t>4.2. Plan opérationnel du projet (Phasage sur 12 mois)</w:t>
       </w:r>
     </w:p>
     <w:p>
@@ -2166,10 +2510,10 @@
         <w:rPr>
           <w:b/>
         </w:rPr>
-        <w:t xml:space="preserve">• Mois 1-2 (R&amp;D Métrologique) : </w:t>
+        <w:t xml:space="preserve">• Mois 1-2 (R&amp;D Technique Dyadique) : </w:t>
       </w:r>
       <w:r>
-        <w:t>Configuration de la synchronisation réseau local NTP inter-lunettes Neon (&lt; 5 ms) et scénographie du comptoir avec tablette orientable (Otterbring et al., 2014).</w:t>
+        <w:t>Synchronisation réseau local Wi-Fi NTP de 2 paires de lunettes Neon (&lt; 5 ms). Aménagement scénographique du comptoir d'accueil avec tablette orientable (Otterbring et al., 2014).</w:t>
       </w:r>
     </w:p>
     <w:p>
@@ -2181,10 +2525,10 @@
         <w:rPr>
           <w:b/>
         </w:rPr>
-        <w:t xml:space="preserve">• Mois 3-5 (Collecte Dyadique) : </w:t>
+        <w:t xml:space="preserve">• Mois 3-5 (Collecte &amp; Autoconfrontation) : </w:t>
       </w:r>
       <w:r>
-        <w:t>20 passations dyadiques complètes (2 paires Neon) immédiatement suivies d'entretiens d'autoconfrontation de 45 minutes par étudiant (Theureau, 2016).</w:t>
+        <w:t>20 binômes complets (20 étudiants B3 face à 5 profils de clients comédiens). Session de 1h15 : 15 min d'interaction sous double Neon immédiatement suivie de 45 min d'entretien d'autoconfrontation avec l'étudiant (Theureau, 2016).</w:t>
       </w:r>
     </w:p>
     <w:p>
@@ -2196,10 +2540,10 @@
         <w:rPr>
           <w:b/>
         </w:rPr>
-        <w:t xml:space="preserve">• Mois 6-8 (Modélisation Mixte) : </w:t>
+        <w:t xml:space="preserve">• Mois 6-8 (Modélisation mixte) : </w:t>
       </w:r>
       <w:r>
-        <w:t>Calcul de la synchronie temporelle par récurrence croisée (CRQA) et découpage sémiotique du verbatim en unités d'action-signe.</w:t>
+        <w:t>Calcul de la synchronie des regards par récurrence croisée (CRQA). Découpage des paroles d'autoconfrontation en unités d'action-signe (UAS).</w:t>
       </w:r>
     </w:p>
     <w:p>
@@ -2211,10 +2555,10 @@
         <w:rPr>
           <w:b/>
         </w:rPr>
-        <w:t xml:space="preserve">• Mois 9-12 (Synthèse &amp; Valorisation) : </w:t>
+        <w:t xml:space="preserve">• Mois 9-12 (Synthèse &amp; Monographie) : </w:t>
       </w:r>
       <w:r>
-        <w:t>Croisement qualitatif/quantitatif des dilemmes vécus et rédaction d'une monographie sur l'intelligence relationnelle en hospitalité.</w:t>
+        <w:t>Croisement des moments de rupture oculaire avec les peurs verbalisées par les étudiants. Rédaction de la monographie Lab-DRA sur l'intelligence relationnelle.</w:t>
       </w:r>
     </w:p>
     <w:p>
@@ -2226,7 +2570,7 @@
           <w:b/>
           <w:color w:val="0E86D4"/>
         </w:rPr>
-        <w:t>4.3. Grille des indicateurs opérationnels (Proposition 3)</w:t>
+        <w:t>4.3. Grille complète des indicateurs opérationnels (Proposition 3)</w:t>
       </w:r>
     </w:p>
     <w:tbl>
@@ -2260,7 +2604,7 @@
                 <w:color w:val="FFFFFF"/>
                 <w:sz w:val="17"/>
               </w:rPr>
-              <w:t>Indicateur</w:t>
+              <w:t>Indicateur vulgarisé</w:t>
             </w:r>
           </w:p>
         </w:tc>
@@ -2282,7 +2626,7 @@
                 <w:color w:val="FFFFFF"/>
                 <w:sz w:val="17"/>
               </w:rPr>
-              <w:t>Métrique &amp; Calcul</w:t>
+              <w:t>Mode de calcul</w:t>
             </w:r>
           </w:p>
         </w:tc>
@@ -2304,7 +2648,7 @@
                 <w:color w:val="FFFFFF"/>
                 <w:sz w:val="17"/>
               </w:rPr>
-              <w:t>Outil de Recueil</w:t>
+              <w:t>Signification pour la recherche</w:t>
             </w:r>
           </w:p>
         </w:tc>
@@ -2326,7 +2670,7 @@
                 <w:color w:val="FFFFFF"/>
                 <w:sz w:val="17"/>
               </w:rPr>
-              <w:t>Justification État de l'Art</w:t>
+              <w:t>Ancrage État de l'Art</w:t>
             </w:r>
           </w:p>
         </w:tc>
@@ -2348,7 +2692,7 @@
               <w:rPr>
                 <w:sz w:val="16"/>
               </w:rPr>
-              <w:t>Taux de Contact Visuel Direct</w:t>
+              <w:t>Regard les yeux dans les yeux (%)</w:t>
             </w:r>
           </w:p>
         </w:tc>
@@ -2368,7 +2712,7 @@
               <w:rPr>
                 <w:sz w:val="16"/>
               </w:rPr>
-              <w:t>% de temps où les vecteurs de regard des deux acteurs se croisent mutuellement.</w:t>
+              <w:t>Intersection des deux regards dans la zone des yeux de l'autre.</w:t>
             </w:r>
           </w:p>
         </w:tc>
@@ -2388,7 +2732,7 @@
               <w:rPr>
                 <w:sz w:val="16"/>
               </w:rPr>
-              <w:t>Calcul intersection 2x Neon</w:t>
+              <w:t>Révèle la fréquence réelle et la brièveté du contact visuel social.</w:t>
             </w:r>
           </w:p>
         </w:tc>
@@ -2408,7 +2752,7 @@
               <w:rPr>
                 <w:sz w:val="16"/>
               </w:rPr>
-              <w:t>Rogers et al. (2018) : Discontinuité réelle du contact visuel.</w:t>
+              <w:t>Rogers et al. (2018) (Dual Eye Tracking)</w:t>
             </w:r>
           </w:p>
         </w:tc>
@@ -2430,7 +2774,7 @@
               <w:rPr>
                 <w:sz w:val="16"/>
               </w:rPr>
-              <w:t>Attention Conjointe Tablette</w:t>
+              <w:t>Regard commun sur la tablette</w:t>
             </w:r>
           </w:p>
         </w:tc>
@@ -2450,7 +2794,7 @@
               <w:rPr>
                 <w:sz w:val="16"/>
               </w:rPr>
-              <w:t>Durée cumulée où le réceptionniste et le client fixent la tablette ensemble (+/- 200 ms).</w:t>
+              <w:t>Durée où les 2 paires de lunettes fixent ensemble la tablette (+/- 200 ms).</w:t>
             </w:r>
           </w:p>
         </w:tc>
@@ -2470,7 +2814,7 @@
               <w:rPr>
                 <w:sz w:val="16"/>
               </w:rPr>
-              <w:t>Détection conjointe AOI</w:t>
+              <w:t>Marqueur d'attention conjointe : regarder l'offre commerciale ensemble.</w:t>
             </w:r>
           </w:p>
         </w:tc>
@@ -2490,7 +2834,7 @@
               <w:rPr>
                 <w:sz w:val="16"/>
               </w:rPr>
-              <w:t>Wohltjen &amp; Wheatley (2021) &amp; Otterbring (2014) : Co-attention d'upselling.</w:t>
+              <w:t>Wohltjen &amp; Wheatley (2021) &amp; Otterbring (2014)</w:t>
             </w:r>
           </w:p>
         </w:tc>
@@ -2512,7 +2856,7 @@
               <w:rPr>
                 <w:sz w:val="16"/>
               </w:rPr>
-              <w:t>Contagion Émotionnelle</w:t>
+              <w:t>Délai de réaction à la parole</w:t>
             </w:r>
           </w:p>
         </w:tc>
@@ -2532,7 +2876,7 @@
               <w:rPr>
                 <w:sz w:val="16"/>
               </w:rPr>
-              <w:t>Délai d'alignement temporel entre le sourire de l'employé et l'apaisement facial du client.</w:t>
+              <w:t>Temps (ms) mis par le réceptionniste à regarder le client dès qu'il parle.</w:t>
             </w:r>
           </w:p>
         </w:tc>
@@ -2552,7 +2896,7 @@
               <w:rPr>
                 <w:sz w:val="16"/>
               </w:rPr>
-              <w:t>Codage FACS vidéo Neon</w:t>
+              <w:t>Mesure la vivacité de l'écoute active perçue par le client.</w:t>
             </w:r>
           </w:p>
         </w:tc>
@@ -2572,7 +2916,7 @@
               <w:rPr>
                 <w:sz w:val="16"/>
               </w:rPr>
-              <w:t>Hennig-Thurau et al. (2006) : Authenticité émotionnelle réelle.</w:t>
+              <w:t>Tickle-Degnen &amp; Rosenthal (1990) (Coordination)</w:t>
             </w:r>
           </w:p>
         </w:tc>
@@ -2594,7 +2938,7 @@
               <w:rPr>
                 <w:sz w:val="16"/>
               </w:rPr>
-              <w:t>Unités d'Action-Signe (UAS)</w:t>
+              <w:t>Délai de contagion du sourire</w:t>
             </w:r>
           </w:p>
         </w:tc>
@@ -2614,7 +2958,7 @@
               <w:rPr>
                 <w:sz w:val="16"/>
               </w:rPr>
-              <w:t>Décomposition de l'activité vécue : Engagement, Prise d'indice, Interprétation, Action.</w:t>
+              <w:t>Temps entre le sourire du réceptionniste et l'apaisement facial du client.</w:t>
             </w:r>
           </w:p>
         </w:tc>
@@ -2634,7 +2978,7 @@
               <w:rPr>
                 <w:sz w:val="16"/>
               </w:rPr>
-              <w:t>Verbatim autoconfrontation</w:t>
+              <w:t>Teste l'efficacité de la contagion émotionnelle face à une plainte.</w:t>
             </w:r>
           </w:p>
         </w:tc>
@@ -2654,7 +2998,7 @@
               <w:rPr>
                 <w:sz w:val="16"/>
               </w:rPr>
-              <w:t>Theureau / Durand (2016) : Reconstitution du sens pour l'acteur.</w:t>
+              <w:t>Hennig-Thurau et al. (2006) (Contagion émotionnelle)</w:t>
             </w:r>
           </w:p>
         </w:tc>
@@ -2676,7 +3020,7 @@
               <w:rPr>
                 <w:sz w:val="16"/>
               </w:rPr>
-              <w:t>Dilemmes Décisionnels Vécus</w:t>
+              <w:t>Unités d'Action-Signe (UAS)</w:t>
             </w:r>
           </w:p>
         </w:tc>
@@ -2696,7 +3040,7 @@
               <w:rPr>
                 <w:sz w:val="16"/>
               </w:rPr>
-              <w:t>Moments de tension explicités par l'étudiant face aux contraintes du logiciel et du client.</w:t>
+              <w:t>Découpage du verbatim en autoconfrontation (intentions, peurs, actions).</w:t>
             </w:r>
           </w:p>
         </w:tc>
@@ -2716,7 +3060,7 @@
               <w:rPr>
                 <w:sz w:val="16"/>
               </w:rPr>
-              <w:t>Questions CDM (Crandall)</w:t>
+              <w:t>Permet de comprendre le sens que l'étudiant donnait à son comportement.</w:t>
             </w:r>
           </w:p>
         </w:tc>
@@ -2736,7 +3080,89 @@
               <w:rPr>
                 <w:sz w:val="16"/>
               </w:rPr>
-              <w:t>Crandall, Klein &amp; Hoffman (2006) : Explicitation des savoirs tacites.</w:t>
+              <w:t>Theureau / Durand (2016) (Cours d'action)</w:t>
+            </w:r>
+          </w:p>
+        </w:tc>
+      </w:tr>
+      <w:tr>
+        <w:tc>
+          <w:tcPr>
+            <w:tcW w:type="dxa" w:w="2340"/>
+            <w:shd w:val="clear" w:color="auto" w:fill="F9FAFC"/>
+            <w:tcMar>
+              <w:top w:w="50" w:type="dxa"/>
+              <w:bottom w:w="50" w:type="dxa"/>
+              <w:left w:w="60" w:type="dxa"/>
+              <w:right w:w="60" w:type="dxa"/>
+            </w:tcMar>
+          </w:tcPr>
+          <w:p>
+            <w:r>
+              <w:rPr>
+                <w:sz w:val="16"/>
+              </w:rPr>
+              <w:t>Dilemmes décisionnels exprimés</w:t>
+            </w:r>
+          </w:p>
+        </w:tc>
+        <w:tc>
+          <w:tcPr>
+            <w:tcW w:type="dxa" w:w="2340"/>
+            <w:shd w:val="clear" w:color="auto" w:fill="F9FAFC"/>
+            <w:tcMar>
+              <w:top w:w="50" w:type="dxa"/>
+              <w:bottom w:w="50" w:type="dxa"/>
+              <w:left w:w="60" w:type="dxa"/>
+              <w:right w:w="60" w:type="dxa"/>
+            </w:tcMar>
+          </w:tcPr>
+          <w:p>
+            <w:r>
+              <w:rPr>
+                <w:sz w:val="16"/>
+              </w:rPr>
+              <w:t>Nombre de conflits intérieurs verbalisés (ex. : peur d'insister pour l'upselling).</w:t>
+            </w:r>
+          </w:p>
+        </w:tc>
+        <w:tc>
+          <w:tcPr>
+            <w:tcW w:type="dxa" w:w="2340"/>
+            <w:shd w:val="clear" w:color="auto" w:fill="F9FAFC"/>
+            <w:tcMar>
+              <w:top w:w="50" w:type="dxa"/>
+              <w:bottom w:w="50" w:type="dxa"/>
+              <w:left w:w="60" w:type="dxa"/>
+              <w:right w:w="60" w:type="dxa"/>
+            </w:tcMar>
+          </w:tcPr>
+          <w:p>
+            <w:r>
+              <w:rPr>
+                <w:sz w:val="16"/>
+              </w:rPr>
+              <w:t>Met au jour les freins psychologiques bloquant la vente.</w:t>
+            </w:r>
+          </w:p>
+        </w:tc>
+        <w:tc>
+          <w:tcPr>
+            <w:tcW w:type="dxa" w:w="2340"/>
+            <w:shd w:val="clear" w:color="auto" w:fill="F9FAFC"/>
+            <w:tcMar>
+              <w:top w:w="50" w:type="dxa"/>
+              <w:bottom w:w="50" w:type="dxa"/>
+              <w:left w:w="60" w:type="dxa"/>
+              <w:right w:w="60" w:type="dxa"/>
+            </w:tcMar>
+          </w:tcPr>
+          <w:p>
+            <w:r>
+              <w:rPr>
+                <w:sz w:val="16"/>
+              </w:rPr>
+              <w:t>Crandall, Klein &amp; Hoffman (2006) (Méthode CDM)</w:t>
             </w:r>
           </w:p>
         </w:tc>
@@ -2758,7 +3184,7 @@
           <w:color w:val="1B365D"/>
           <w:sz w:val="30"/>
         </w:rPr>
-        <w:t>5. Recommandation Stratégique pour le Chercheur Principal</w:t>
+        <w:t>5. Recommandations Stratégiques pour Jérôme Foguenne</w:t>
       </w:r>
     </w:p>
     <w:p>
@@ -2766,14 +3192,14 @@
         <w:spacing w:line="276" w:lineRule="auto"/>
       </w:pPr>
       <w:r>
-        <w:t>Pour maximiser la rentabilité scientifique et l'impact pédagogique du projet SIMACCUEIL, il est préconisé un déploiement séquentiel en entonnoir :</w:t>
+        <w:t>1. Option Recommandée pour l'HECh (Impact Formation Immédiat) :</w:t>
+        <w:br/>
+        <w:t>Si votre priorité est de valoriser immédiatement l'achat de vos lunettes Pupil Labs Neon auprès de votre direction et de vos étudiants en créant un outil de cours innovant, choisissez la PROPOSITION 2 (Intervention Didactique EMME Spotlight). En 10 mois, vous disposez d'un dispositif pédagogique novateur, testé scientifiquement et utilisable chaque année avec vos étudiants sur Moodle.</w:t>
         <w:br/>
         <w:br/>
-        <w:t>1. Année 1 (Proposition 1 - Comparatif Experts/Novices) : Rodage du laboratoire, calibration fine des AOI selon Hooge et al. (2024), publication internationale de référence sur la 'Vision Professionnelle' en hospitalité.</w:t>
+        <w:t>2. Option Recommandée pour la Recherche Pure (Publications Internationales) :</w:t>
         <w:br/>
-        <w:t>2. Année 2 (Proposition 2 - Intervention Didactique EMME) : Traduction des marqueurs d'expertise en capsules pédagogiques 'Spotlight' évaluées par essai randomisé auprès des étudiants de l'HECh/HEL.</w:t>
-        <w:br/>
-        <w:t>3. Année 3 / Thèse (Proposition 3 - Dyadique Dual Eye Tracking) : Exploration en profondeur de la synchronie sociale et du cours d'action pour asseoir la réputation internationale du Lab-DRA dans le domaine des interactions de service avancées.</w:t>
+        <w:t>Si votre objectif prioritaire est de positionner le Lab-DRA au plus haut niveau scientifique pour attirer des financements de recherche externe, commencez par la PROPOSITION 1 (Comparatif Experts/Novices) en Année 1. Elle posera les bases objectives indispensables pour aborder ensuite la PROPOSITION 3 (Dyadique) dans le cadre d'un doctorat ou d'un projet de recherche pluriannuel d'envergure.</w:t>
       </w:r>
     </w:p>
     <w:sectPr>
@@ -2796,7 +3222,7 @@
       <w:jc w:val="center"/>
     </w:pPr>
     <w:r>
-      <w:t>HECh / HEL — Jérôme Foguenne (Chercheur Principal)  |  Rapport Méthodologique Officiel</w:t>
+      <w:t>HECh / HEL — Jérôme Foguenne (Chercheur Principal)  |  Guide Méthodologique Approfondi</w:t>
     </w:r>
   </w:p>
 </w:ftr>
@@ -2810,7 +3236,7 @@
       <w:jc w:val="right"/>
     </w:pPr>
     <w:r>
-      <w:t>Lab-DRA | SIMACCUEIL — Trois Propositions Méthodologiques de Recherche</w:t>
+      <w:t>Lab-DRA | SIMACCUEIL — Guide Méthodologique Opérationnel &amp; Vulgarisé</w:t>
     </w:r>
   </w:p>
 </w:hdr>

</xml_diff>

<commit_message>
docs: traité méthodologique exhaustif pour SIMACCUEIL (Word, Markdown et scripts)
</commit_message>
<xml_diff>
--- a/docs/Propositions_Methodologiques_SIMACCUEIL.docx
+++ b/docs/Propositions_Methodologiques_SIMACCUEIL.docx
@@ -29,7 +29,7 @@
           <w:color w:val="1B365D"/>
           <w:sz w:val="48"/>
         </w:rPr>
-        <w:t>GUIDE MÉTHODOLOGIQUE OPÉRATIONNEL &amp; VULGARISÉ</w:t>
+        <w:t>TRAITÉ MÉTHODOLOGIQUE EXHAUSTIF</w:t>
       </w:r>
     </w:p>
     <w:p>
@@ -40,9 +40,9 @@
         <w:rPr>
           <w:rFonts w:ascii="Calibri" w:hAnsi="Calibri"/>
           <w:color w:val="2C3E50"/>
-          <w:sz w:val="25"/>
+          <w:sz w:val="24"/>
         </w:rPr>
-        <w:t>Trois Propositions Méthodologiques Détaillées pour le Projet SIMACCUEIL</w:t>
+        <w:t>Trois Propositions Méthodologiques Complètes, Vulgarisées &amp; Opérationnelles pour le Projet SIMACCUEIL</w:t>
         <w:br/>
         <w:t>Oculométrie Mobile (Pupil Labs Neon), Didactique Professionnelle &amp; Accueil Hôtelier (Upselling &amp; Réclamations)</w:t>
       </w:r>
@@ -232,7 +232,7 @@
                 <w:color w:val="1B365D"/>
                 <w:sz w:val="19"/>
               </w:rPr>
-              <w:t>Destinataires &amp; Finalités</w:t>
+              <w:t>Finalités Stratégiques</w:t>
             </w:r>
           </w:p>
         </w:tc>
@@ -256,7 +256,7 @@
                 <w:color w:val="2C3E50"/>
                 <w:sz w:val="19"/>
               </w:rPr>
-              <w:t>Conseil de Recherche Lab-DRA, corps professoral HECh/HEL &amp; partenaires hôteliers</w:t>
+              <w:t>Dossier de candidature recherche, financements compétitifs &amp; innovation curriculaire</w:t>
             </w:r>
           </w:p>
         </w:tc>
@@ -278,154 +278,204 @@
           <w:color w:val="1B365D"/>
           <w:sz w:val="32"/>
         </w:rPr>
-        <w:t>1. Avant-propos : Glossaire &amp; Principes Clés Vulgarisés</w:t>
+        <w:t>1. Cadre Général, Épistémologie &amp; Glossaire Vulgarisé</w:t>
       </w:r>
     </w:p>
     <w:p>
       <w:pPr>
-        <w:spacing w:after="80"/>
+        <w:spacing w:line="276" w:lineRule="auto" w:after="160"/>
+      </w:pPr>
+      <w:r>
+        <w:t>Au comptoir de réception d'un hôtel haut de gamme, le personnel est soumis à une injonction paradoxale permanente : d'un côté, une exigence relationnelle et empathique maximale (accueillir le client, pratiquer l'écoute active, apaiser une réclamation, négocier un surclassement) ; de l'autre, une contrainte procédurale et informatique lourde (manipuler le PMS, contrôler les tarifs, vérifier les disponibilités). Le projet SIMACCUEIL étudie cette tension à travers l'oculométrie mobile de dernière génération (Pupil Labs Neon). Afin de concilier la plus stricte rigueur académique et une accessibilité pédagogique totale, les concepts clés sont définis ci-après :</w:t>
+      </w:r>
+    </w:p>
+    <w:p>
+      <w:pPr>
+        <w:spacing w:after="60"/>
         <w:ind w:left="288"/>
       </w:pPr>
       <w:r>
         <w:rPr>
           <w:b/>
           <w:color w:val="0E86D4"/>
-          <w:sz w:val="20"/>
+          <w:sz w:val="19"/>
         </w:rPr>
-        <w:t xml:space="preserve">• Oculométrie mobile (Eye Tracking mobile) : </w:t>
+        <w:t xml:space="preserve">• Oculométrie mobile (Wearable Eye Tracking) : </w:t>
       </w:r>
       <w:r>
         <w:rPr>
           <w:color w:val="2C3E50"/>
-          <w:sz w:val="20"/>
+          <w:sz w:val="19"/>
         </w:rPr>
-        <w:t>Technique de mesure du regard au moyen de lunettes légères (Pupil Labs Neon). Elle permet aux participants de bouger librement et d'interagir face-à-face avec une personne réelle tout en consultant un écran.</w:t>
+        <w:t>Technique de mesure continue du regard au moyen de lunettes légères (Pupil Labs Neon, 200 Hz). Contrairement aux systèmes de bureau qui imposent l'immobilité devant un écran d'ordinateur, ces lunettes permettent au réceptionniste d'interagir naturellement en face-à-face tout en consultant son logiciel et sa tablette.</w:t>
       </w:r>
     </w:p>
     <w:p>
       <w:pPr>
-        <w:spacing w:after="80"/>
+        <w:spacing w:after="60"/>
         <w:ind w:left="288"/>
       </w:pPr>
       <w:r>
         <w:rPr>
           <w:b/>
           <w:color w:val="0E86D4"/>
-          <w:sz w:val="20"/>
+          <w:sz w:val="19"/>
         </w:rPr>
         <w:t xml:space="preserve">• Fixation &amp; Saccade : </w:t>
       </w:r>
       <w:r>
         <w:rPr>
           <w:color w:val="2C3E50"/>
-          <w:sz w:val="20"/>
+          <w:sz w:val="19"/>
         </w:rPr>
-        <w:t>Une fixation est un arrêt du regard (au moins 100 ms) où le cerveau traite l'information. Une saccade est le saut rapide (20-40 ms) d'un point à un autre, pendant lequel la vision est neutralisée.</w:t>
+        <w:t>Une fixation est un arrêt stable du regard (au moins 100 ms) durant lequel le cerveau prélève et traite l'information visuelle nette. Une saccade est le saut ultra-rapide (20 à 40 ms) d'un point à un autre, pendant lequel le cerveau neutralise temporairement la vision pour éviter le flou de mouvement.</w:t>
       </w:r>
     </w:p>
     <w:p>
       <w:pPr>
-        <w:spacing w:after="80"/>
+        <w:spacing w:after="60"/>
         <w:ind w:left="288"/>
       </w:pPr>
       <w:r>
         <w:rPr>
           <w:b/>
           <w:color w:val="0E86D4"/>
-          <w:sz w:val="20"/>
+          <w:sz w:val="19"/>
         </w:rPr>
         <w:t xml:space="preserve">• Zones d'Intérêt (AOI - Areas of Interest) : </w:t>
       </w:r>
       <w:r>
         <w:rPr>
           <w:color w:val="2C3E50"/>
-          <w:sz w:val="20"/>
+          <w:sz w:val="19"/>
         </w:rPr>
-        <w:t>Régions découpées sur l'image pour quantifier l'attention (AOI statiques sur l'écran d'ordinateur fixe vs AOI dynamiques sur le visage du client en mouvement ou la tablette).</w:t>
+        <w:t>Régions virtuelles découpées dans l'environnement pour comptabiliser les métriques du regard : AOI statiques sur l'écran fixe du PMS vs AOI dynamiques suivant le visage du client en mouvement ou la tablette manipulée.</w:t>
       </w:r>
     </w:p>
     <w:p>
       <w:pPr>
-        <w:spacing w:after="80"/>
+        <w:spacing w:after="60"/>
         <w:ind w:left="288"/>
       </w:pPr>
       <w:r>
         <w:rPr>
           <w:b/>
           <w:color w:val="0E86D4"/>
-          <w:sz w:val="20"/>
+          <w:sz w:val="19"/>
         </w:rPr>
-        <w:t xml:space="preserve">• Charge cognitive (CLT) : </w:t>
+        <w:t xml:space="preserve">• Charge cognitive (Cognitive Load Theory - CLT) : </w:t>
       </w:r>
       <w:r>
         <w:rPr>
           <w:color w:val="2C3E50"/>
-          <w:sz w:val="20"/>
+          <w:sz w:val="19"/>
         </w:rPr>
-        <w:t>Quantité d'effort mental mobilisée en mémoire de travail. La charge extrinsèque est le gaspillage d'énergie causé par un logiciel mal maîtrisé ; son automatisation libère de l'espace mental pour regarder le client.</w:t>
+        <w:t>Quantité d'effort mental mobilisée dans la mémoire de travail. La charge extrinsèque est le gaspillage d'énergie causé par la mauvaise maîtrise d'un logiciel ; son automatisation libère des ressources pour observer le client.</w:t>
       </w:r>
     </w:p>
     <w:p>
       <w:pPr>
-        <w:spacing w:after="80"/>
+        <w:spacing w:after="60"/>
         <w:ind w:left="288"/>
       </w:pPr>
       <w:r>
         <w:rPr>
           <w:b/>
           <w:color w:val="0E86D4"/>
-          <w:sz w:val="20"/>
+          <w:sz w:val="19"/>
         </w:rPr>
         <w:t xml:space="preserve">• PMS (Property Management System) : </w:t>
       </w:r>
       <w:r>
         <w:rPr>
           <w:color w:val="2C3E50"/>
-          <w:sz w:val="20"/>
+          <w:sz w:val="19"/>
         </w:rPr>
-        <w:t>Logiciel hôtelier utilisé à la réception pour vérifier les réservations, attribuer les chambres et enregistrer les arrivées.</w:t>
+        <w:t>Progiciel central d'exploitation hôtelière (planning des chambres, profils clients, facturation, assignation des clés).</w:t>
       </w:r>
     </w:p>
     <w:p>
       <w:pPr>
-        <w:spacing w:after="80"/>
+        <w:spacing w:after="60"/>
         <w:ind w:left="288"/>
       </w:pPr>
       <w:r>
         <w:rPr>
           <w:b/>
           <w:color w:val="0E86D4"/>
-          <w:sz w:val="20"/>
+          <w:sz w:val="19"/>
         </w:rPr>
-        <w:t xml:space="preserve">• Upselling : </w:t>
+        <w:t xml:space="preserve">• Upselling Multicanal : </w:t>
       </w:r>
       <w:r>
         <w:rPr>
           <w:color w:val="2C3E50"/>
-          <w:sz w:val="20"/>
+          <w:sz w:val="19"/>
         </w:rPr>
-        <w:t>Technique commerciale proposant au client une prestation supérieure à celle réservée (chambre surclassée, suite, options) moyennant un supplément tarifaire négocié.</w:t>
+        <w:t>Action commerciale consistant à proposer au voyageur une prestation supérieure (chambre plus spacieuse, vue, suite) moyennant un supplément de prix, en articulant les consultations préalables en ligne et la négociation physique en réception.</w:t>
       </w:r>
     </w:p>
     <w:p>
       <w:pPr>
-        <w:spacing w:after="80"/>
+        <w:spacing w:after="60"/>
         <w:ind w:left="288"/>
       </w:pPr>
       <w:r>
         <w:rPr>
           <w:b/>
           <w:color w:val="0E86D4"/>
-          <w:sz w:val="20"/>
+          <w:sz w:val="19"/>
         </w:rPr>
         <w:t xml:space="preserve">• EMME (Eye-Movement Modelling Examples) : </w:t>
       </w:r>
       <w:r>
         <w:rPr>
           <w:color w:val="2C3E50"/>
-          <w:sz w:val="20"/>
+          <w:sz w:val="19"/>
         </w:rPr>
-        <w:t>Méthode d'apprentissage par observation où l'étudiant visionne une vidéo montrant les gestes d'un expert avec la superposition dynamique de son regard.</w:t>
+        <w:t>Dispositif d'apprentissage par observation où l'étudiant visionne une vidéo montrant un expert en action avec la superposition dynamique de son regard.</w:t>
+      </w:r>
+    </w:p>
+    <w:p>
+      <w:pPr>
+        <w:spacing w:after="60"/>
+        <w:ind w:left="288"/>
+      </w:pPr>
+      <w:r>
+        <w:rPr>
+          <w:b/>
+          <w:color w:val="0E86D4"/>
+          <w:sz w:val="19"/>
+        </w:rPr>
+        <w:t xml:space="preserve">• Effet Spotlight : </w:t>
+      </w:r>
+      <w:r>
+        <w:rPr>
+          <w:color w:val="2C3E50"/>
+          <w:sz w:val="19"/>
+        </w:rPr>
+        <w:t>Technique visuelle pour les vidéos EMME où la zone regardée par l'expert est maintenue en pleine clarté tandis que le reste de la scène est doucement estompé dans un voile flou, guidant le regard sans distraction.</w:t>
+      </w:r>
+    </w:p>
+    <w:p>
+      <w:pPr>
+        <w:spacing w:after="60"/>
+        <w:ind w:left="288"/>
+      </w:pPr>
+      <w:r>
+        <w:rPr>
+          <w:b/>
+          <w:color w:val="0E86D4"/>
+          <w:sz w:val="19"/>
+        </w:rPr>
+        <w:t xml:space="preserve">• Cours d'action &amp; Autoconfrontation : </w:t>
+      </w:r>
+      <w:r>
+        <w:rPr>
+          <w:color w:val="2C3E50"/>
+          <w:sz w:val="19"/>
+        </w:rPr>
+        <w:t>Paradigme ergonomique postulant que l'activité humaine est une construction de sens propre à l'acteur. L'entretien d'autoconfrontation consiste à faire visionner au participant sa propre vidéo sous eye tracking pour recueillir son point de vue sur son vécu intérieur.</w:t>
       </w:r>
     </w:p>
     <w:p>
@@ -438,7 +488,7 @@
           <w:color w:val="1B365D"/>
           <w:sz w:val="24"/>
         </w:rPr>
-        <w:t>Tableau Comparatif des Trois Trajectoires Méthodologiques</w:t>
+        <w:t>Matrice Comparée des Trois Propositions Méthodologiques</w:t>
       </w:r>
     </w:p>
     <w:tbl>
@@ -799,7 +849,7 @@
               <w:rPr>
                 <w:sz w:val="17"/>
               </w:rPr>
-              <w:t>2 paires de lunettes Neon synchronisées en Wi-Fi NTP.</w:t>
+              <w:t>2 paires de lunettes Neon synchronisées en Wi-Fi NTP (&lt; 5 ms).</w:t>
             </w:r>
           </w:p>
         </w:tc>
@@ -995,7 +1045,7 @@
         <w:rPr>
           <w:i/>
         </w:rPr>
-        <w:t>Intitulé vulgarisé : « Observer pour comprendre : Qu'est-ce qui différencie le regard d'un réceptionniste débutant de celui d'un professionnel expérimenté face à un client ? »</w:t>
+        <w:t>Intitulé académique : « La Vision Professionnelle en Action : Étude comparative transversale de l'allocation attentionnelle, de la charge cognitive et de la performance relationnelle en accueil hôtelier instrumenté »</w:t>
       </w:r>
     </w:p>
     <w:p>
@@ -1007,7 +1057,7 @@
           <w:b/>
           <w:color w:val="0E86D4"/>
         </w:rPr>
-        <w:t>2.1. Justification théorique vulgarisée &amp; Ancrage dans l'état de l'art</w:t>
+        <w:t>2.1. Justification théorique approfondie &amp; Ancrage dans l'état de l'art</w:t>
       </w:r>
     </w:p>
     <w:p>
@@ -1015,86 +1065,45 @@
         <w:spacing w:line="276" w:lineRule="auto"/>
       </w:pPr>
       <w:r>
-        <w:t>Pourquoi comparer des étudiants débutants, des étudiants de fin de cursus et des professionnels en poste ?</w:t>
+        <w:t>Cette méthodologie repose sur les théories cognitives de l'expertise visuelle et du Naturalistic Decision Making (NDM) :</w:t>
         <w:br/>
-        <w:t>1. L'œil de l'expert va droit au but : Gegenfurtner et al. (2011) démontrent sur 73 études que les experts ne regardent pas 'plus' de choses, mais regardent mieux et plus vite. Le professionnel ignore les informations inutiles pour cibler immédiatement la case essentielle sur l'écran (hypothèse de réduction de l'information).</w:t>
+        <w:t>1. Lois universelles du regard expert : La méta-analyse de Gegenfurtner, Lehtinen et Säljö (2011) sur 73 études établit que les experts fixent moins longtemps, éliminent l'information redondante (information reduction) et utilisent leur empan parafovéal pour atteindre plus rapidement l'information critique (modèle holistique). En réception hôtelière, l'expert ne cherche pas au hasard : il accède immédiatement au dossier d'upselling.</w:t>
         <w:br/>
-        <w:t>2. Le logiciel monopolise l'esprit du débutant : Selon Beckmann (2010), le manque de familiarité avec un logiciel sature la mémoire de travail (charge extrinsèque). L'étudiant débutant n'a plus assez d'espace mental pour regarder le client. À l'inverse, chez l'expert, la manipulation du PMS est automatisée, libérant son regard pour la relation.</w:t>
+        <w:t>2. Cadre de complexité et libération mentale : Beckmann (2010) démontre que la charge extrinsèque sature la mémoire de travail de l'opérateur non familier d'un outil. Chez l'expert, l'automatisation logicielle libère des ressources cérébrales, lui permettant de relever les yeux et de lire les signaux non verbaux du voyageur.</w:t>
         <w:br/>
-        <w:t>3. La vision professionnelle : Goodwin (1994) et Wolff et al. (2016) prouvent que l'expertise confère une vision panoramique distribuée, détectant les indices critiques que le novice ignore.</w:t>
+        <w:t>3. La vision professionnelle située : Goodwin (1994) et Wolff et al. (2016) prouvent que l'expertise dote le professionnel d'une vision panoramique distribuée.</w:t>
         <w:br/>
-        <w:t>4. Le Quiet Eye : Vickers (2016) montre que les experts stabilisent leur regard (au moins 100 ms) juste avant une action décisive. Nous testons si cette pause oculaire stabilise la persuasion en upselling.</w:t>
+        <w:t>4. Le Quiet Eye régulateur : Vickers (2016) démontre que la dernière fixation stabilisée avant une action décisive est 62% plus longue chez les experts. Nous testons si cette fixation calme sur le client ou le tarif renforce la persuasion commerciale.</w:t>
         <w:br/>
-        <w:t>5. Validation de la qualité relationnelle : Cortina et al. (2015) ont établi que les mesures d'eye tracking mobile convergent fidèlement avec les grilles d'évaluation de la qualité de service.</w:t>
+        <w:t>5. Validation low/high-inference : Cortina et al. (2015) attestent que les mesures d'eye tracking mobile convergent étroitement avec les notes de qualité de service attribuées par des observateurs indépendants.</w:t>
+        <w:br/>
+        <w:t>6. Référentiel d'upselling : Intégration des standards opérationnels du Ritz-Carlton Bali documentés par Ruki (2023) et de l'approche omnicanale de Denizci Guillet (2020).</w:t>
       </w:r>
     </w:p>
     <w:p>
+      <w:pPr>
+        <w:spacing w:before="160"/>
+      </w:pPr>
       <w:r>
         <w:rPr>
           <w:b/>
           <w:color w:val="0E86D4"/>
         </w:rPr>
-        <w:t>2.2. Plan opérationnel du projet (Phasage sur 12 mois)</w:t>
+        <w:t>2.2. Dispositif expérimental &amp; Scénarisation pas à pas</w:t>
       </w:r>
     </w:p>
     <w:p>
       <w:pPr>
-        <w:spacing w:after="40"/>
-        <w:ind w:left="288"/>
+        <w:spacing w:line="276" w:lineRule="auto"/>
       </w:pPr>
       <w:r>
-        <w:rPr>
-          <w:b/>
-        </w:rPr>
-        <w:t xml:space="preserve">• Mois 1-2 (Cadrage &amp; Test Pilote) : </w:t>
-      </w:r>
-      <w:r>
-        <w:t>Scénarisation de 2 cas (Upselling multicanal selon Denizci Guillet, 2020 et Réclamation selon Ruki, 2023). Standardisation des comédiens jouant les clients. Calibrage des AOI écran et tablette selon Hooge et al. (2024).</w:t>
-      </w:r>
-    </w:p>
-    <w:p>
-      <w:pPr>
-        <w:spacing w:after="40"/>
-        <w:ind w:left="288"/>
-      </w:pPr>
-      <w:r>
-        <w:rPr>
-          <w:b/>
-        </w:rPr>
-        <w:t xml:space="preserve">• Mois 3-5 (Recueil sur 60 participants) : </w:t>
-      </w:r>
-      <w:r>
-        <w:t>Passation de 60 sujets équipés des lunettes Neon (20 Novices B1, 20 Intermédiaires B3, 20 Professionnels 4*-5*). Session de 35 minutes par sujet : accueil, 2 simulations enregistrées (yeux 200 Hz, vidéo HD, audio, logs) et questionnaire d'effort mental.</w:t>
-      </w:r>
-    </w:p>
-    <w:p>
-      <w:pPr>
-        <w:spacing w:after="40"/>
-        <w:ind w:left="288"/>
-      </w:pPr>
-      <w:r>
-        <w:rPr>
-          <w:b/>
-        </w:rPr>
-        <w:t xml:space="preserve">• Mois 6-8 (Traitement &amp; Vision par ordinateur) : </w:t>
-      </w:r>
-      <w:r>
-        <w:t>Détection semi-automatique des AOI écran, tablette et visage client par le pipeline IA de De Beugher et al. (2014). Double codage en aveugle de la qualité relationnelle par des enseignants (grille CLASS).</w:t>
-      </w:r>
-    </w:p>
-    <w:p>
-      <w:pPr>
-        <w:spacing w:after="40"/>
-        <w:ind w:left="288"/>
-      </w:pPr>
-      <w:r>
-        <w:rPr>
-          <w:b/>
-        </w:rPr>
-        <w:t xml:space="preserve">• Mois 9-12 (Analyses statistiques &amp; Livrables) : </w:t>
-      </w:r>
-      <w:r>
-        <w:t>Analyses ANOVA à mesures répétées, formalisation du 'Guide des Bonnes Pratiques Visuelles en Réception' pour l'HECh et soumission d'article scientifique.</w:t>
+        <w:t>• Échantillon (N = 60) : 20 Novices (B1 n'ayant jamais fait de stage), 20 Intermédiaires (B3 ayant validé leurs stages de réception) et 20 Professionnels chevronnés d'hôtels 4*-5* (minimum 3 ans d'ancienneté).</w:t>
+        <w:br/>
+        <w:t>• Scénario 1 - Upselling Multicanal (7 min) : Le client a réservé une Chambre Standard à 140 €/nuit. Une alerte PMS indique qu'il a consulté la Suite Exécutive en ligne. Le réceptionniste doit exploiter l'information, proposer le tarif préférentiel à 60 € de supplément par nuit et argumenter sur tablette tactile.</w:t>
+        <w:br/>
+        <w:t>• Scénario 2 - Réclamation Critique (7 min) : Le client arrive pressé pour une visioconférence urgente. Le PMS indique que sa chambre est bloquée suite à une fuite d'eau. Le réceptionniste doit écouter sans interrompre, maintenir le contact oculaire et proposer un salon de travail immédiat avec surclassement offert en Junior Suite après sa réunion.</w:t>
+        <w:br/>
+        <w:t>• Déroulement minuté (45 min par sujet) : Accueil &amp; équipement Neon (10 min) -&gt; Prise en main (5 min) -&gt; Scénario 1 (7 min) -&gt; Pause (3 min) -&gt; Scénario 2 (7 min) -&gt; Questionnaire NASA-TLX &amp; Beckmann (8 min) -&gt; Clôture (5 min).</w:t>
       </w:r>
     </w:p>
     <w:p>
@@ -1140,7 +1149,7 @@
                 <w:color w:val="FFFFFF"/>
                 <w:sz w:val="17"/>
               </w:rPr>
-              <w:t>Indicateur vulgarisé</w:t>
+              <w:t>Indicateur</w:t>
             </w:r>
           </w:p>
         </w:tc>
@@ -1162,7 +1171,7 @@
                 <w:color w:val="FFFFFF"/>
                 <w:sz w:val="17"/>
               </w:rPr>
-              <w:t>Mode de calcul</w:t>
+              <w:t>Métrique &amp; Calcul</w:t>
             </w:r>
           </w:p>
         </w:tc>
@@ -1184,7 +1193,7 @@
                 <w:color w:val="FFFFFF"/>
                 <w:sz w:val="17"/>
               </w:rPr>
-              <w:t>Signification pour la recherche</w:t>
+              <w:t>Outil de Mesure</w:t>
             </w:r>
           </w:p>
         </w:tc>
@@ -1206,7 +1215,7 @@
                 <w:color w:val="FFFFFF"/>
                 <w:sz w:val="17"/>
               </w:rPr>
-              <w:t>Ancrage État de l'Art</w:t>
+              <w:t>Justification État de l'Art</w:t>
             </w:r>
           </w:p>
         </w:tc>
@@ -1228,7 +1237,7 @@
               <w:rPr>
                 <w:sz w:val="16"/>
               </w:rPr>
-              <w:t>Temps passé sur l'écran (%)</w:t>
+              <w:t>Dwell Time PMS (%)</w:t>
             </w:r>
           </w:p>
         </w:tc>
@@ -1248,7 +1257,7 @@
               <w:rPr>
                 <w:sz w:val="16"/>
               </w:rPr>
-              <w:t>(Temps fixation écran / Durée totale) * 100.</w:t>
+              <w:t>(Temps fixation écran / Durée totale) * 100</w:t>
             </w:r>
           </w:p>
         </w:tc>
@@ -1268,7 +1277,7 @@
               <w:rPr>
                 <w:sz w:val="16"/>
               </w:rPr>
-              <w:t>Mesure si l'opérateur est prisonnier de son outil informatique.</w:t>
+              <w:t>Pupil Labs Neon (Surface AOI)</w:t>
             </w:r>
           </w:p>
         </w:tc>
@@ -1288,7 +1297,7 @@
               <w:rPr>
                 <w:sz w:val="16"/>
               </w:rPr>
-              <w:t>Beckmann (2010) (Charge extrinsèque)</w:t>
+              <w:t>Beckmann (2010) : Charge extrinsèque liée au manque d'automatisation logicielle.</w:t>
             </w:r>
           </w:p>
         </w:tc>
@@ -1310,7 +1319,7 @@
               <w:rPr>
                 <w:sz w:val="16"/>
               </w:rPr>
-              <w:t>Temps pour trouver l'info clé (ms)</w:t>
+              <w:t>TTFF Champ Tarifaire</w:t>
             </w:r>
           </w:p>
         </w:tc>
@@ -1330,7 +1339,7 @@
               <w:rPr>
                 <w:sz w:val="16"/>
               </w:rPr>
-              <w:t>Chronomètre jusqu'à la 1re fixation sur le statut de chambre.</w:t>
+              <w:t>Latence (ms) jusqu'à la 1re fixation sur le surclassement</w:t>
             </w:r>
           </w:p>
         </w:tc>
@@ -1350,7 +1359,7 @@
               <w:rPr>
                 <w:sz w:val="16"/>
               </w:rPr>
-              <w:t>Prouve si l'opérateur sait où regarder sans hésiter.</w:t>
+              <w:t>Logs PMS synchronisés Neon</w:t>
             </w:r>
           </w:p>
         </w:tc>
@@ -1370,7 +1379,7 @@
               <w:rPr>
                 <w:sz w:val="16"/>
               </w:rPr>
-              <w:t>Gegenfurtner et al. (2011) (Modèle holistique)</w:t>
+              <w:t>Gegenfurtner et al. (2011) : Accès parafovéal plus rapide chez l'expert.</w:t>
             </w:r>
           </w:p>
         </w:tc>
@@ -1392,7 +1401,7 @@
               <w:rPr>
                 <w:sz w:val="16"/>
               </w:rPr>
-              <w:t>Ratio Visage / Écran</w:t>
+              <w:t>Ratio Regard Client / PMS</w:t>
             </w:r>
           </w:p>
         </w:tc>
@@ -1412,7 +1421,7 @@
               <w:rPr>
                 <w:sz w:val="16"/>
               </w:rPr>
-              <w:t>Temps regard client / Temps regard écran.</w:t>
+              <w:t>Temps fixation Visage Client / Temps fixation Écran PMS</w:t>
             </w:r>
           </w:p>
         </w:tc>
@@ -1432,7 +1441,7 @@
               <w:rPr>
                 <w:sz w:val="16"/>
               </w:rPr>
-              <w:t>Ratio &lt; 0.5 = communication rompue ; &gt; 1.2 = relation prépondérante.</w:t>
+              <w:t>Calcul automatique de ratio</w:t>
             </w:r>
           </w:p>
         </w:tc>
@@ -1452,7 +1461,7 @@
               <w:rPr>
                 <w:sz w:val="16"/>
               </w:rPr>
-              <w:t>Wolff et al. (2016) (Vision distribuée)</w:t>
+              <w:t>Wolff et al. (2016) : Mesure de la vision distribuée vs cécité écran.</w:t>
             </w:r>
           </w:p>
         </w:tc>
@@ -1474,7 +1483,7 @@
               <w:rPr>
                 <w:sz w:val="16"/>
               </w:rPr>
-              <w:t>Regard fixe avant parole (Quiet Eye)</w:t>
+              <w:t>Quiet Eye Duration (QED)</w:t>
             </w:r>
           </w:p>
         </w:tc>
@@ -1494,7 +1503,7 @@
               <w:rPr>
                 <w:sz w:val="16"/>
               </w:rPr>
-              <w:t>Durée (ms) de la fixation stable juste avant d'annoncer l'offre.</w:t>
+              <w:t>Durée (ms) de la dernière fixation stable avant parole</w:t>
             </w:r>
           </w:p>
         </w:tc>
@@ -1514,7 +1523,7 @@
               <w:rPr>
                 <w:sz w:val="16"/>
               </w:rPr>
-              <w:t>Indique le temps de préparation mentale et de contrôle émotionnel.</w:t>
+              <w:t>Microphone + Neon</w:t>
             </w:r>
           </w:p>
         </w:tc>
@@ -1534,7 +1543,7 @@
               <w:rPr>
                 <w:sz w:val="16"/>
               </w:rPr>
-              <w:t>Vickers (2016) (Quiet Eye)</w:t>
+              <w:t>Vickers (2016) : Préparation cognitive et motrice optimale.</w:t>
             </w:r>
           </w:p>
         </w:tc>
@@ -1556,7 +1565,7 @@
               <w:rPr>
                 <w:sz w:val="16"/>
               </w:rPr>
-              <w:t>Fréquence des sourires sincères</w:t>
+              <w:t>Duchenne Smile Frequency</w:t>
             </w:r>
           </w:p>
         </w:tc>
@@ -1576,7 +1585,7 @@
               <w:rPr>
                 <w:sz w:val="16"/>
               </w:rPr>
-              <w:t>Nombre de sourires authentiques (Duchenne) relevés sur la vidéo.</w:t>
+              <w:t>Nombre de sourires authentiques (contraction orbiculaire)</w:t>
             </w:r>
           </w:p>
         </w:tc>
@@ -1596,7 +1605,7 @@
               <w:rPr>
                 <w:sz w:val="16"/>
               </w:rPr>
-              <w:t>Différencie la chaleur naturelle du simple masque commercial forcé.</w:t>
+              <w:t>Vidéo HD de face (codage FACS)</w:t>
             </w:r>
           </w:p>
         </w:tc>
@@ -1616,7 +1625,7 @@
               <w:rPr>
                 <w:sz w:val="16"/>
               </w:rPr>
-              <w:t>Hennig-Thurau et al. (2006) (Travail émotionnel)</w:t>
+              <w:t>Hennig-Thurau et al. (2006) : Authenticité vs travail émotionnel de surface.</w:t>
             </w:r>
           </w:p>
         </w:tc>
@@ -1638,7 +1647,7 @@
               <w:rPr>
                 <w:sz w:val="16"/>
               </w:rPr>
-              <w:t>Taux de succès de l'upselling</w:t>
+              <w:t>Score de Rapport Non Verbal</w:t>
             </w:r>
           </w:p>
         </w:tc>
@@ -1658,7 +1667,7 @@
               <w:rPr>
                 <w:sz w:val="16"/>
               </w:rPr>
-              <w:t>Résultat binaire (Surclassement accepté : Oui / Non) et montant.</w:t>
+              <w:t>Score composite sur 7 points (attention, positivité, coordination)</w:t>
             </w:r>
           </w:p>
         </w:tc>
@@ -1678,7 +1687,7 @@
               <w:rPr>
                 <w:sz w:val="16"/>
               </w:rPr>
-              <w:t>Mesure la performance commerciale concrète de l'interaction.</w:t>
+              <w:t>Grille CLASS (Cortina 2015)</w:t>
             </w:r>
           </w:p>
         </w:tc>
@@ -1698,7 +1707,89 @@
               <w:rPr>
                 <w:sz w:val="16"/>
               </w:rPr>
-              <w:t>Denizci Guillet (2020) &amp; Ruki (2023)</w:t>
+              <w:t>Tickle-Degnen &amp; Rosenthal (1990) &amp; Cortina (2015) : Validation par convergence.</w:t>
+            </w:r>
+          </w:p>
+        </w:tc>
+      </w:tr>
+      <w:tr>
+        <w:tc>
+          <w:tcPr>
+            <w:tcW w:type="dxa" w:w="2340"/>
+            <w:shd w:val="clear" w:color="auto" w:fill="FFFFFF"/>
+            <w:tcMar>
+              <w:top w:w="50" w:type="dxa"/>
+              <w:bottom w:w="50" w:type="dxa"/>
+              <w:left w:w="60" w:type="dxa"/>
+              <w:right w:w="60" w:type="dxa"/>
+            </w:tcMar>
+          </w:tcPr>
+          <w:p>
+            <w:r>
+              <w:rPr>
+                <w:sz w:val="16"/>
+              </w:rPr>
+              <w:t>Taux de Succès Upselling</w:t>
+            </w:r>
+          </w:p>
+        </w:tc>
+        <w:tc>
+          <w:tcPr>
+            <w:tcW w:type="dxa" w:w="2340"/>
+            <w:shd w:val="clear" w:color="auto" w:fill="FFFFFF"/>
+            <w:tcMar>
+              <w:top w:w="50" w:type="dxa"/>
+              <w:bottom w:w="50" w:type="dxa"/>
+              <w:left w:w="60" w:type="dxa"/>
+              <w:right w:w="60" w:type="dxa"/>
+            </w:tcMar>
+          </w:tcPr>
+          <w:p>
+            <w:r>
+              <w:rPr>
+                <w:sz w:val="16"/>
+              </w:rPr>
+              <w:t>Variable binaire : 1 si surclassement accepté, 0 si refusé</w:t>
+            </w:r>
+          </w:p>
+        </w:tc>
+        <w:tc>
+          <w:tcPr>
+            <w:tcW w:type="dxa" w:w="2340"/>
+            <w:shd w:val="clear" w:color="auto" w:fill="FFFFFF"/>
+            <w:tcMar>
+              <w:top w:w="50" w:type="dxa"/>
+              <w:bottom w:w="50" w:type="dxa"/>
+              <w:left w:w="60" w:type="dxa"/>
+              <w:right w:w="60" w:type="dxa"/>
+            </w:tcMar>
+          </w:tcPr>
+          <w:p>
+            <w:r>
+              <w:rPr>
+                <w:sz w:val="16"/>
+              </w:rPr>
+              <w:t>Log de clôture du PMS</w:t>
+            </w:r>
+          </w:p>
+        </w:tc>
+        <w:tc>
+          <w:tcPr>
+            <w:tcW w:type="dxa" w:w="2340"/>
+            <w:shd w:val="clear" w:color="auto" w:fill="FFFFFF"/>
+            <w:tcMar>
+              <w:top w:w="50" w:type="dxa"/>
+              <w:bottom w:w="50" w:type="dxa"/>
+              <w:left w:w="60" w:type="dxa"/>
+              <w:right w:w="60" w:type="dxa"/>
+            </w:tcMar>
+          </w:tcPr>
+          <w:p>
+            <w:r>
+              <w:rPr>
+                <w:sz w:val="16"/>
+              </w:rPr>
+              <w:t>Denizci Guillet (2020) &amp; Ruki (2023) : Performance commerciale finale.</w:t>
             </w:r>
           </w:p>
         </w:tc>
@@ -1728,7 +1819,7 @@
         <w:rPr>
           <w:i/>
         </w:rPr>
-        <w:t>Intitulé vulgarisé : « Apprendre à travers les yeux d'un expert : Des capsules vidéo montrant le regard d'un professionnel permettent-elles aux étudiants de mieux réussir l'accueil ? »</w:t>
+        <w:t>Intitulé académique : « Ingénierie Pédagogique par Modélisation du Regard (EMME) : Évaluation de l'impact d'un guidage attentionnel 'Spotlight' sur l'apprentissage des compétences d'accueil hôtelier »</w:t>
       </w:r>
     </w:p>
     <w:p>
@@ -1740,7 +1831,7 @@
           <w:b/>
           <w:color w:val="0E86D4"/>
         </w:rPr>
-        <w:t>3.1. Justification théorique vulgarisée &amp; Ancrage dans l'état de l'art</w:t>
+        <w:t>3.1. Justification théorique approfondie &amp; Ancrage dans l'état de l'art</w:t>
       </w:r>
     </w:p>
     <w:p>
@@ -1748,84 +1839,45 @@
         <w:spacing w:line="276" w:lineRule="auto"/>
       </w:pPr>
       <w:r>
-        <w:t>Pourquoi utiliser des vidéos enrichies du regard de l'expert pour former les étudiants ?</w:t>
+        <w:t>Cette méthodologie interventionnelle s'appuie directement sur les sciences de l'apprentissage multimédia et de la didactique professionnelle :</w:t>
         <w:br/>
-        <w:t>1. Rendre visible l'invisible sans distraire : Jarodzka et al. (2012) démontrent qu'un simple cercle rouge sur une vidéo distrait l'apprenant. En revanche, la technique du 'Spotlight' (zone regardée nette, environnement périphérique estompé à 40%) guide doucement l'attention sans détruire la vue d'ensemble.</w:t>
+        <w:t>1. Modélisation oculaire par effet Spotlight : Jarodzka et al. (2012) démontrent qu'un simple cercle rouge sur une vidéo distrait l'apprenant. En revanche, la technique du 'Spotlight' (zone regardée nette, environnement périphérique estompé à 40%) guide doucement l'attention sans détruire la vue d'ensemble, produisant des gains diagnostiques durables sans guidage ultérieur.</w:t>
         <w:br/>
-        <w:t>2. Accélérer l'apprentissage visuel : Seppänen &amp; Gegenfurtner (2012) confirment qu'observer le parcours oculaire d'un enseignant chevronné aide les étudiants à adopter un balayage méthodique.</w:t>
+        <w:t>2. Accélération de l'inspection méthodique : Seppänen &amp; Gegenfurtner (2012) confirment qu'observer le regard d'un enseignant chevronné aide les novices à structurer leur balayage visuel.</w:t>
         <w:br/>
-        <w:t>3. Éviter le piège de la redondance : Van Gog et al. (2009) ont prouvé que cumuler une trace visuelle avec de longs discours audio sature la mémoire de travail. Les capsules doivent donc être très courtes (2 min 30) et ciblées sur des gestes professionnels précis.</w:t>
+        <w:t>3. Prévention de la redondance attentionnelle : Van Gog, Paas, Marcus, Ayres et Sweller (2009) ont prouvé qu'associer un flux de regard à de longs discours audio sature la mémoire de travail. Les capsules doivent être très courtes (2 min 30) et focalisées sur le sens des gestes professionnels.</w:t>
         <w:br/>
-        <w:t>4. Les silences comme révélateur didactique : Elling et al. (2012) révèlent que les silences face à l'écran (27% du temps) traduisent souvent une surcharge cognitive. L'efficacité de la formation se mesurera par la réduction des silences de blocage face au client.</w:t>
+        <w:t>4. Les silences comme révélateur didactique : Elling, Lentz et de Jong (2012) révèlent que les silences face à l'écran (27% du temps) traduisent une surcharge cognitive. L'efficacité du dispositif se mesurera par la baisse des silences de blocage face au client.</w:t>
+        <w:br/>
+        <w:t>5. Rigueur des zones d'intérêt : Hooge et al. (2024) prescrivent de dimensionner les marges des AOI en tenant compte de la résolution angulaire pour garantir la reproductibilité.</w:t>
       </w:r>
     </w:p>
     <w:p>
+      <w:pPr>
+        <w:spacing w:before="160"/>
+      </w:pPr>
       <w:r>
         <w:rPr>
           <w:b/>
           <w:color w:val="0E86D4"/>
         </w:rPr>
-        <w:t>3.2. Plan opérationnel du projet (Phasage sur 10 mois)</w:t>
+        <w:t>3.2. Dispositif expérimental &amp; Essai contrôlé randomisé (RCT sur 10 mois)</w:t>
       </w:r>
     </w:p>
     <w:p>
       <w:pPr>
-        <w:spacing w:after="40"/>
-        <w:ind w:left="288"/>
+        <w:spacing w:line="276" w:lineRule="auto"/>
       </w:pPr>
       <w:r>
-        <w:rPr>
-          <w:b/>
-        </w:rPr>
-        <w:t xml:space="preserve">• Mois 1-3 (Production des capsules) : </w:t>
-      </w:r>
-      <w:r>
-        <w:t>Tournage de 4 cas modèles sous lunettes Neon avec un chef de réception confirmé. Développement informatique du filtre vidéo Spotlight (Python/FFmpeg). Scénarisation de capsules de 2 min 30 avec voix off sobre.</w:t>
-      </w:r>
-    </w:p>
-    <w:p>
-      <w:pPr>
-        <w:spacing w:after="40"/>
-        <w:ind w:left="288"/>
-      </w:pPr>
-      <w:r>
-        <w:rPr>
-          <w:b/>
-        </w:rPr>
-        <w:t xml:space="preserve">• Mois 4-6 (Essai comparatif randomisé RCT) : </w:t>
-      </w:r>
-      <w:r>
-        <w:t>50 étudiants de Bachelier en Gestion Hôtelière répartis par tirage au sort (25 en Groupe Expérimental Spotlight vs 25 en Groupe Contrôle classique). Protocole : Pré-test T0 (simulation sous Neon) -&gt; 3 semaines d'apprentissage -&gt; Post-test T1 (nouvelle simulation sous Neon).</w:t>
-      </w:r>
-    </w:p>
-    <w:p>
-      <w:pPr>
-        <w:spacing w:after="40"/>
-        <w:ind w:left="288"/>
-      </w:pPr>
-      <w:r>
-        <w:rPr>
-          <w:b/>
-        </w:rPr>
-        <w:t xml:space="preserve">• Mois 7-8 (Traitement des gains &amp; silences) : </w:t>
-      </w:r>
-      <w:r>
-        <w:t>Calcul des deltas de progression Delta(T1 - T0). Analyse chronométrique des silences de blocage (&gt; 2 s) selon Elling et al. (2012) et mesure de l'effort mental sur l'échelle de Paas.</w:t>
-      </w:r>
-    </w:p>
-    <w:p>
-      <w:pPr>
-        <w:spacing w:after="40"/>
-        <w:ind w:left="288"/>
-      </w:pPr>
-      <w:r>
-        <w:rPr>
-          <w:b/>
-        </w:rPr>
-        <w:t xml:space="preserve">• Mois 9-10 (Déploiement curriculaire HECh) : </w:t>
-      </w:r>
-      <w:r>
-        <w:t>Mise à disposition pérenne des capsules sur Moodle HECh/HEL et journée de dissémination pédagogique pour les formateurs.</w:t>
+        <w:t>• Population (N = 50 étudiants de Bloc 2 en Gestion Hôtelière HECh/HEL) répartis par tirage au sort stratifié :</w:t>
+        <w:br/>
+        <w:t xml:space="preserve">  - Bras Expérimental (N = 25) : Formation enrichie des 4 capsules vidéo interactives EMME Spotlight.</w:t>
+        <w:br/>
+        <w:t xml:space="preserve">  - Bras Contrôle (N = 25) : Formation sur les mêmes cas avec vidéos conventionnelles sans regard et fiches mémo écrites.</w:t>
+        <w:br/>
+        <w:t>• Les 4 Capsules Spotlight (2 min 30 chacune) : Module 1 (Repérage de l'opportunité d'upselling sur PMS) -&gt; Module 2 (Présentation de la suite sur tablette) -&gt; Module 3 (Écoute active sans fuite visuelle lors d'une réclamation) -&gt; Module 4 (Vérification rapide des disponibilités et annonce de compensation).</w:t>
+        <w:br/>
+        <w:t>• Protocole expérimental : Pré-test T0 (simulation sous Neon) -&gt; 3 semaines d'intervention (45 min/semaine) -&gt; Post-test T1 (nouveau scénario équivalent sous Neon).</w:t>
       </w:r>
     </w:p>
     <w:p>
@@ -1871,7 +1923,7 @@
                 <w:color w:val="FFFFFF"/>
                 <w:sz w:val="17"/>
               </w:rPr>
-              <w:t>Indicateur vulgarisé</w:t>
+              <w:t>Indicateur</w:t>
             </w:r>
           </w:p>
         </w:tc>
@@ -1893,7 +1945,7 @@
                 <w:color w:val="FFFFFF"/>
                 <w:sz w:val="17"/>
               </w:rPr>
-              <w:t>Mode de calcul</w:t>
+              <w:t>Métrique &amp; Calcul</w:t>
             </w:r>
           </w:p>
         </w:tc>
@@ -1915,7 +1967,7 @@
                 <w:color w:val="FFFFFF"/>
                 <w:sz w:val="17"/>
               </w:rPr>
-              <w:t>Signification pour la recherche</w:t>
+              <w:t>Outil de Mesure</w:t>
             </w:r>
           </w:p>
         </w:tc>
@@ -1937,7 +1989,7 @@
                 <w:color w:val="FFFFFF"/>
                 <w:sz w:val="17"/>
               </w:rPr>
-              <w:t>Ancrage État de l'Art</w:t>
+              <w:t>Justification État de l'Art</w:t>
             </w:r>
           </w:p>
         </w:tc>
@@ -1959,7 +2011,7 @@
               <w:rPr>
                 <w:sz w:val="16"/>
               </w:rPr>
-              <w:t>Gain d'attention client (Delta RC)</w:t>
+              <w:t>Gain Attentionnel Client</w:t>
             </w:r>
           </w:p>
         </w:tc>
@@ -1979,7 +2031,7 @@
               <w:rPr>
                 <w:sz w:val="16"/>
               </w:rPr>
-              <w:t>% Temps regard client en T1 moins % en T0.</w:t>
+              <w:t>% Temps regard client en T1 moins % en T0</w:t>
             </w:r>
           </w:p>
         </w:tc>
@@ -1999,7 +2051,7 @@
               <w:rPr>
                 <w:sz w:val="16"/>
               </w:rPr>
-              <w:t>Valide que l'étudiant ose lever les yeux de son écran vers le client.</w:t>
+              <w:t>Pupil Labs Neon (AOI Visage Client)</w:t>
             </w:r>
           </w:p>
         </w:tc>
@@ -2019,7 +2071,7 @@
               <w:rPr>
                 <w:sz w:val="16"/>
               </w:rPr>
-              <w:t>Jarodzka et al. (2012) (Guidage Spotlight)</w:t>
+              <w:t>Jarodzka et al. (2012) : Transfert réussi du balayage visuel vers l'humain.</w:t>
             </w:r>
           </w:p>
         </w:tc>
@@ -2041,7 +2093,7 @@
               <w:rPr>
                 <w:sz w:val="16"/>
               </w:rPr>
-              <w:t>Gain de fluidité logicielle (Delta EP)</w:t>
+              <w:t>Réduction Errance PMS</w:t>
             </w:r>
           </w:p>
         </w:tc>
@@ -2061,7 +2113,7 @@
               <w:rPr>
                 <w:sz w:val="16"/>
               </w:rPr>
-              <w:t>Temps perdu à chercher sur le PMS en T0 moins ce temps en T1.</w:t>
+              <w:t>Temps perdu sur le PMS en T0 moins ce temps en T1</w:t>
             </w:r>
           </w:p>
         </w:tc>
@@ -2081,7 +2133,7 @@
               <w:rPr>
                 <w:sz w:val="16"/>
               </w:rPr>
-              <w:t>Démontre que la modélisation a transmis la trajectoire visuelle experte.</w:t>
+              <w:t>Surface tracking sur écran PMS</w:t>
             </w:r>
           </w:p>
         </w:tc>
@@ -2101,7 +2153,7 @@
               <w:rPr>
                 <w:sz w:val="16"/>
               </w:rPr>
-              <w:t>Seppänen &amp; Gegenfurtner (2012) (Modélisation)</w:t>
+              <w:t>Seppänen &amp; Gegenfurtner (2012) : Élimination des fixations parasites.</w:t>
             </w:r>
           </w:p>
         </w:tc>
@@ -2123,7 +2175,7 @@
               <w:rPr>
                 <w:sz w:val="16"/>
               </w:rPr>
-              <w:t>Baisse des silences bloquants</w:t>
+              <w:t>Silences Bloquants</w:t>
             </w:r>
           </w:p>
         </w:tc>
@@ -2143,7 +2195,7 @@
               <w:rPr>
                 <w:sz w:val="16"/>
               </w:rPr>
-              <w:t>Durée cumulée des silences &gt; 2 s avec regard figé sur l'ordinateur.</w:t>
+              <w:t>Durée cumulée des pauses verbales &gt; 2 s avec regard figé</w:t>
             </w:r>
           </w:p>
         </w:tc>
@@ -2163,7 +2215,7 @@
               <w:rPr>
                 <w:sz w:val="16"/>
               </w:rPr>
-              <w:t>Prouve que l'étudiant ne subit plus de surcharge mentale bloquante.</w:t>
+              <w:t>Spectrogramme audio + tracker</w:t>
             </w:r>
           </w:p>
         </w:tc>
@@ -2183,7 +2235,7 @@
               <w:rPr>
                 <w:sz w:val="16"/>
               </w:rPr>
-              <w:t>Elling et al. (2012) (Traitement des silences)</w:t>
+              <w:t>Elling, Lentz &amp; de Jong (2012) : Révélateur de la saturation cognitive.</w:t>
             </w:r>
           </w:p>
         </w:tc>
@@ -2205,7 +2257,7 @@
               <w:rPr>
                 <w:sz w:val="16"/>
               </w:rPr>
-              <w:t>Score d'allègement mental</w:t>
+              <w:t>Effort Mental Ressenti</w:t>
             </w:r>
           </w:p>
         </w:tc>
@@ -2225,7 +2277,7 @@
               <w:rPr>
                 <w:sz w:val="16"/>
               </w:rPr>
-              <w:t>Différence de note sur l'échelle de Paas (1 à 9 points).</w:t>
+              <w:t>Différence de score sur l'échelle psychométrique de Paas</w:t>
             </w:r>
           </w:p>
         </w:tc>
@@ -2245,7 +2297,7 @@
               <w:rPr>
                 <w:sz w:val="16"/>
               </w:rPr>
-              <w:t>Confirme que le dispositif a rendu l'activité plus fluide et moins stressante.</w:t>
+              <w:t>Questionnaire post-simulation</w:t>
             </w:r>
           </w:p>
         </w:tc>
@@ -2265,7 +2317,7 @@
               <w:rPr>
                 <w:sz w:val="16"/>
               </w:rPr>
-              <w:t>Van Gog et al. (2009) &amp; Beckmann (2010)</w:t>
+              <w:t>Van Gog et al. (2009) &amp; Beckmann (2010) : Allègement de l'effort mental.</w:t>
             </w:r>
           </w:p>
         </w:tc>
@@ -2287,7 +2339,7 @@
               <w:rPr>
                 <w:sz w:val="16"/>
               </w:rPr>
-              <w:t>Score de persuasion en upselling</w:t>
+              <w:t>Qualité Offre Upselling</w:t>
             </w:r>
           </w:p>
         </w:tc>
@@ -2307,7 +2359,7 @@
               <w:rPr>
                 <w:sz w:val="16"/>
               </w:rPr>
-              <w:t>Grille sur 20 points évaluant la mise en valeur des bénéfices chambre.</w:t>
+              <w:t>Score sur 20 points évalué par grille critériée</w:t>
             </w:r>
           </w:p>
         </w:tc>
@@ -2327,7 +2379,7 @@
               <w:rPr>
                 <w:sz w:val="16"/>
               </w:rPr>
-              <w:t>Mesure la conversion concrète de l'aisance visuelle en succès commercial.</w:t>
+              <w:t>Évaluation professorale</w:t>
             </w:r>
           </w:p>
         </w:tc>
@@ -2347,7 +2399,7 @@
               <w:rPr>
                 <w:sz w:val="16"/>
               </w:rPr>
-              <w:t>Ruki (2023) &amp; Otterbring et al. (2014)</w:t>
+              <w:t>Ruki (2023) &amp; Denizci Guillet (2020) : Performance commerciale concrète.</w:t>
             </w:r>
           </w:p>
         </w:tc>
@@ -2369,7 +2421,7 @@
               <w:rPr>
                 <w:sz w:val="16"/>
               </w:rPr>
-              <w:t>Score d'écoute (Réclamation)</w:t>
+              <w:t>Écoute Active Réclamation</w:t>
             </w:r>
           </w:p>
         </w:tc>
@@ -2389,7 +2441,7 @@
               <w:rPr>
                 <w:sz w:val="16"/>
               </w:rPr>
-              <w:t>Note sur 20 portant sur l'attitude calme et l'absence de coupure de parole.</w:t>
+              <w:t>Durée cumulée de regard sur le client pendant l'exposé du grief</w:t>
             </w:r>
           </w:p>
         </w:tc>
@@ -2409,7 +2461,7 @@
               <w:rPr>
                 <w:sz w:val="16"/>
               </w:rPr>
-              <w:t>Démontre la capacité à gérer l'incident sans se cacher derrière l'écran.</w:t>
+              <w:t>AOI Visage sous Neon</w:t>
             </w:r>
           </w:p>
         </w:tc>
@@ -2429,7 +2481,7 @@
               <w:rPr>
                 <w:sz w:val="16"/>
               </w:rPr>
-              <w:t>Tickle-Degnen &amp; Rosenthal (1990)</w:t>
+              <w:t>Tickle-Degnen &amp; Rosenthal (1990) : Maintien de l'attention mutuelle.</w:t>
             </w:r>
           </w:p>
         </w:tc>
@@ -2459,7 +2511,7 @@
         <w:rPr>
           <w:i/>
         </w:rPr>
-        <w:t>Intitulé vulgarisé : « Se regarder, se comprendre, s'écouter : Que se passe-t-il vraiment dans les yeux et dans la tête du réceptionniste et du client pendant qu'ils se parlent ? »</w:t>
+        <w:t>Intitulé académique : « Énaction et Synchronie Sociale : Analyse dyadique de l'interaction d'accueil hôtelier par double oculométrie mobile synchronisée et entretiens d'autoconfrontation du cours d'action »</w:t>
       </w:r>
     </w:p>
     <w:p>
@@ -2471,7 +2523,7 @@
           <w:b/>
           <w:color w:val="0E86D4"/>
         </w:rPr>
-        <w:t>4.1. Justification théorique vulgarisée &amp; Ancrage dans l'état de l'art</w:t>
+        <w:t>4.1. Justification théorique approfondie &amp; Ancrage dans l'état de l'art</w:t>
       </w:r>
     </w:p>
     <w:p>
@@ -2479,86 +2531,53 @@
         <w:spacing w:line="276" w:lineRule="auto"/>
       </w:pPr>
       <w:r>
-        <w:t>Pourquoi équiper le client ET le réceptionniste de lunettes en même temps, puis faire un débriefing d'autoconfrontation ?</w:t>
+        <w:t>Cette proposition à la pointe de la recherche mondiale étudie la relation comme un système dynamique couplé en temps réel :</w:t>
         <w:br/>
-        <w:t>1. La communication est une danse à deux : Rogers et al. (2018) prouvent en dual eye tracking que les interlocuteurs ne se regardent pas dans les yeux en continu. L'aversion visuelle est normale pour réfléchir ; l'enjeu est de savoir quand rétablir le contact.</w:t>
+        <w:t>1. La réalité du regard social face-à-face (Dual Eye Tracking) : Rogers, Speelman, Guidetti et Longmuir (2018) prouvent dans Scientific Reports que le regard mutuel direct ne représente qu'une infime proportion du temps total. Détourner les yeux est indispensable pour réfléchir sans surcharge cognitive. Il est donc crucial de mesurer précisément à quel moment le contact visuel se rompt et se rétablit.</w:t>
         <w:br/>
-        <w:t>2. Le rythme de l'attention partagée : Wohltjen &amp; Wheatley (2021) révèlent dans PNAS que le contact oculaire marque le sommet de la connexion, suivi immédiatement d'une rupture salutaire pour permettre à chacun de penser. Alterner entre le client et la tablette d'upselling est la respiration naturelle de l'échange.</w:t>
+        <w:t>2. Le rythme respiratoire de l'attention partagée : Wohltjen et Wheatley (2021) révèlent dans les PNAS que le contact visuel marque l'apogée de l'attention conjointe, suivi d'une désynchronisation salutaire permettant à chacun de penser par lui-même. Alterner entre le client et la tablette d'upselling est la respiration naturelle du dialogue.</w:t>
         <w:br/>
-        <w:t>3. Le rapport interpersonnel synchronisé : Tickle-Degnen &amp; Rosenthal (1990) fondent le rapport sur l'attention mutuelle et la coordination. Deux paires de lunettes mesurent si le client et le réceptionniste regardent la tablette au même moment.</w:t>
+        <w:t>3. Le rapport interpersonnel synchronisé : Tickle-Degnen et Rosenthal (1990) fondent le rapport sur l'attention mutuelle et la coordination. Deux paires de lunettes mesurent si le client et le réceptionniste convergent sur la tablette au même moment.</w:t>
         <w:br/>
-        <w:t>4. Comprendre le vécu intérieur (Cours d'action) : Theureau / Durand (2016) développent l'autoconfrontation : revoir sa vidéo oculaire permet à l'étudiant d'expliciter ce qu'il ressentait.</w:t>
+        <w:t>4. Le cours d'action et l'autoconfrontation : Theureau (recensé par Durand, 2016) postule qu'on ne peut comprendre l'activité sans le sens vécu par l'acteur. L'entretien d'autoconfrontation immédiat permet à l'étudiant de commenter sa propre vidéo oculaire pour expliciter ses doutes et ses intentions.</w:t>
         <w:br/>
-        <w:t>5. Faire émerger les intuitions cachées : La méthode CDM de Crandall, Klein &amp; Hoffman (2006) fait verbaliser les dilemmes inconscients face aux tensions du client.</w:t>
+        <w:t>5. L'explicitation des savoirs tacites : Crandall, Klein et Hoffman (2006) fournissent les techniques de relance de la Cognitive Task Analysis (CTA) pour faire émerger les arbitrages inconscients.</w:t>
+        <w:br/>
+        <w:t>6. L'authenticité affective : Hennig-Thurau et al. (2006) démontrent que seul le sourire authentique déclenche une contagion positive chez le client mécontent.</w:t>
+        <w:br/>
+        <w:t>7. L'orientation active de la tablette : Otterbring et al. (2014) prouvent que la signalétique passive est ignorée, justifiant la manipulation active du support commercial.</w:t>
       </w:r>
     </w:p>
     <w:p>
+      <w:pPr>
+        <w:spacing w:before="160"/>
+      </w:pPr>
       <w:r>
         <w:rPr>
           <w:b/>
           <w:color w:val="0E86D4"/>
         </w:rPr>
-        <w:t>4.2. Plan opérationnel du projet (Phasage sur 12 mois)</w:t>
+        <w:t>4.2. Dispositif dyadique &amp; Méthodologie séquentielle (12 mois)</w:t>
       </w:r>
     </w:p>
     <w:p>
       <w:pPr>
-        <w:spacing w:after="40"/>
-        <w:ind w:left="288"/>
+        <w:spacing w:line="276" w:lineRule="auto"/>
       </w:pPr>
       <w:r>
-        <w:rPr>
-          <w:b/>
-        </w:rPr>
-        <w:t xml:space="preserve">• Mois 1-2 (R&amp;D Technique Dyadique) : </w:t>
-      </w:r>
-      <w:r>
-        <w:t>Synchronisation réseau local Wi-Fi NTP de 2 paires de lunettes Neon (&lt; 5 ms). Aménagement scénographique du comptoir d'accueil avec tablette orientable (Otterbring et al., 2014).</w:t>
-      </w:r>
-    </w:p>
-    <w:p>
-      <w:pPr>
-        <w:spacing w:after="40"/>
-        <w:ind w:left="288"/>
-      </w:pPr>
-      <w:r>
-        <w:rPr>
-          <w:b/>
-        </w:rPr>
-        <w:t xml:space="preserve">• Mois 3-5 (Collecte &amp; Autoconfrontation) : </w:t>
-      </w:r>
-      <w:r>
-        <w:t>20 binômes complets (20 étudiants B3 face à 5 profils de clients comédiens). Session de 1h15 : 15 min d'interaction sous double Neon immédiatement suivie de 45 min d'entretien d'autoconfrontation avec l'étudiant (Theureau, 2016).</w:t>
-      </w:r>
-    </w:p>
-    <w:p>
-      <w:pPr>
-        <w:spacing w:after="40"/>
-        <w:ind w:left="288"/>
-      </w:pPr>
-      <w:r>
-        <w:rPr>
-          <w:b/>
-        </w:rPr>
-        <w:t xml:space="preserve">• Mois 6-8 (Modélisation mixte) : </w:t>
-      </w:r>
-      <w:r>
-        <w:t>Calcul de la synchronie des regards par récurrence croisée (CRQA). Découpage des paroles d'autoconfrontation en unités d'action-signe (UAS).</w:t>
-      </w:r>
-    </w:p>
-    <w:p>
-      <w:pPr>
-        <w:spacing w:after="40"/>
-        <w:ind w:left="288"/>
-      </w:pPr>
-      <w:r>
-        <w:rPr>
-          <w:b/>
-        </w:rPr>
-        <w:t xml:space="preserve">• Mois 9-12 (Synthèse &amp; Monographie) : </w:t>
-      </w:r>
-      <w:r>
-        <w:t>Croisement des moments de rupture oculaire avec les peurs verbalisées par les étudiants. Rédaction de la monographie Lab-DRA sur l'intelligence relationnelle.</w:t>
+        <w:t>• Infrastructure technique : Deux paires de lunettes Pupil Labs Neon connectées à un routeur Wi-Fi 6 dédié avec serveur NTP local (&lt; 5 ms de décalage inter-lunettes).</w:t>
+        <w:br/>
+        <w:t>• Échantillon : 20 binômes complets (20 étudiants B3 face à 5 profils de clients comédiens standardisés).</w:t>
+        <w:br/>
+        <w:t>• Déroulement minuté d'une session (1h15 par étudiant) :</w:t>
+        <w:br/>
+        <w:t xml:space="preserve">  1. Équipement simultané des deux participants sous lunettes Neon (10 min).</w:t>
+        <w:br/>
+        <w:t xml:space="preserve">  2. Simulation écologique au comptoir avec tablette tactile et réclamation impromptue (15 min).</w:t>
+        <w:br/>
+        <w:t xml:space="preserve">  3. Transition immédiate en salle de débriefing (5 min).</w:t>
+        <w:br/>
+        <w:t xml:space="preserve">  4. Entretien d'autoconfrontation du cours d'action conduit par le chercheur (45 min) : l'étudiant visionne sa vidéo de scène enrichie de son regard et de celui du client, et verbalise au présent ce qu'il ressentait, craignait et décidait aux moments de rupture oculaire.</w:t>
       </w:r>
     </w:p>
     <w:p>
@@ -2604,7 +2623,7 @@
                 <w:color w:val="FFFFFF"/>
                 <w:sz w:val="17"/>
               </w:rPr>
-              <w:t>Indicateur vulgarisé</w:t>
+              <w:t>Indicateur</w:t>
             </w:r>
           </w:p>
         </w:tc>
@@ -2626,7 +2645,7 @@
                 <w:color w:val="FFFFFF"/>
                 <w:sz w:val="17"/>
               </w:rPr>
-              <w:t>Mode de calcul</w:t>
+              <w:t>Métrique &amp; Calcul</w:t>
             </w:r>
           </w:p>
         </w:tc>
@@ -2648,7 +2667,7 @@
                 <w:color w:val="FFFFFF"/>
                 <w:sz w:val="17"/>
               </w:rPr>
-              <w:t>Signification pour la recherche</w:t>
+              <w:t>Outil de Mesure</w:t>
             </w:r>
           </w:p>
         </w:tc>
@@ -2670,7 +2689,7 @@
                 <w:color w:val="FFFFFF"/>
                 <w:sz w:val="17"/>
               </w:rPr>
-              <w:t>Ancrage État de l'Art</w:t>
+              <w:t>Justification État de l'Art</w:t>
             </w:r>
           </w:p>
         </w:tc>
@@ -2692,7 +2711,7 @@
               <w:rPr>
                 <w:sz w:val="16"/>
               </w:rPr>
-              <w:t>Regard les yeux dans les yeux (%)</w:t>
+              <w:t>Regard Mutuel Direct (%)</w:t>
             </w:r>
           </w:p>
         </w:tc>
@@ -2712,7 +2731,7 @@
               <w:rPr>
                 <w:sz w:val="16"/>
               </w:rPr>
-              <w:t>Intersection des deux regards dans la zone des yeux de l'autre.</w:t>
+              <w:t>Intersection simultanée des 2 regards dans les yeux de l'autre</w:t>
             </w:r>
           </w:p>
         </w:tc>
@@ -2732,7 +2751,7 @@
               <w:rPr>
                 <w:sz w:val="16"/>
               </w:rPr>
-              <w:t>Révèle la fréquence réelle et la brièveté du contact visuel social.</w:t>
+              <w:t>Calcul géométrique 3D sous Pupil Cloud</w:t>
             </w:r>
           </w:p>
         </w:tc>
@@ -2752,7 +2771,7 @@
               <w:rPr>
                 <w:sz w:val="16"/>
               </w:rPr>
-              <w:t>Rogers et al. (2018) (Dual Eye Tracking)</w:t>
+              <w:t>Rogers et al. (2018) : Discontinuité réelle du contact visuel social.</w:t>
             </w:r>
           </w:p>
         </w:tc>
@@ -2774,7 +2793,7 @@
               <w:rPr>
                 <w:sz w:val="16"/>
               </w:rPr>
-              <w:t>Regard commun sur la tablette</w:t>
+              <w:t>Joint Attention Tablette</w:t>
             </w:r>
           </w:p>
         </w:tc>
@@ -2794,7 +2813,7 @@
               <w:rPr>
                 <w:sz w:val="16"/>
               </w:rPr>
-              <w:t>Durée où les 2 paires de lunettes fixent ensemble la tablette (+/- 200 ms).</w:t>
+              <w:t>Durée cumulée où les 2 flux fixent la tablette ensemble (+/- 200 ms)</w:t>
             </w:r>
           </w:p>
         </w:tc>
@@ -2814,7 +2833,7 @@
               <w:rPr>
                 <w:sz w:val="16"/>
               </w:rPr>
-              <w:t>Marqueur d'attention conjointe : regarder l'offre commerciale ensemble.</w:t>
+              <w:t>Surface AOI Tablette</w:t>
             </w:r>
           </w:p>
         </w:tc>
@@ -2834,7 +2853,7 @@
               <w:rPr>
                 <w:sz w:val="16"/>
               </w:rPr>
-              <w:t>Wohltjen &amp; Wheatley (2021) &amp; Otterbring (2014)</w:t>
+              <w:t>Wohltjen &amp; Wheatley (2021) &amp; Otterbring (2014) : Co-attention d'upselling.</w:t>
             </w:r>
           </w:p>
         </w:tc>
@@ -2856,7 +2875,7 @@
               <w:rPr>
                 <w:sz w:val="16"/>
               </w:rPr>
-              <w:t>Délai de réaction à la parole</w:t>
+              <w:t>Gaze Latency upon Speech</w:t>
             </w:r>
           </w:p>
         </w:tc>
@@ -2876,7 +2895,7 @@
               <w:rPr>
                 <w:sz w:val="16"/>
               </w:rPr>
-              <w:t>Temps (ms) mis par le réceptionniste à regarder le client dès qu'il parle.</w:t>
+              <w:t>Délai (ms) de retour du regard du réceptionniste dès que le client parle</w:t>
             </w:r>
           </w:p>
         </w:tc>
@@ -2896,7 +2915,7 @@
               <w:rPr>
                 <w:sz w:val="16"/>
               </w:rPr>
-              <w:t>Mesure la vivacité de l'écoute active perçue par le client.</w:t>
+              <w:t>Audio multi-canaux + oculométrie</w:t>
             </w:r>
           </w:p>
         </w:tc>
@@ -2916,7 +2935,7 @@
               <w:rPr>
                 <w:sz w:val="16"/>
               </w:rPr>
-              <w:t>Tickle-Degnen &amp; Rosenthal (1990) (Coordination)</w:t>
+              <w:t>Tickle-Degnen &amp; Rosenthal (1990) : Coordination interactionnelle.</w:t>
             </w:r>
           </w:p>
         </w:tc>
@@ -2938,7 +2957,7 @@
               <w:rPr>
                 <w:sz w:val="16"/>
               </w:rPr>
-              <w:t>Délai de contagion du sourire</w:t>
+              <w:t>Sourire Duchenne Synchronisé</w:t>
             </w:r>
           </w:p>
         </w:tc>
@@ -2958,7 +2977,7 @@
               <w:rPr>
                 <w:sz w:val="16"/>
               </w:rPr>
-              <w:t>Temps entre le sourire du réceptionniste et l'apaisement facial du client.</w:t>
+              <w:t>Délai entre le sourire de l'employé et l'apaisement facial du client</w:t>
             </w:r>
           </w:p>
         </w:tc>
@@ -2978,7 +2997,7 @@
               <w:rPr>
                 <w:sz w:val="16"/>
               </w:rPr>
-              <w:t>Teste l'efficacité de la contagion émotionnelle face à une plainte.</w:t>
+              <w:t>Encodage FACS vidéo scène frontale</w:t>
             </w:r>
           </w:p>
         </w:tc>
@@ -2998,7 +3017,7 @@
               <w:rPr>
                 <w:sz w:val="16"/>
               </w:rPr>
-              <w:t>Hennig-Thurau et al. (2006) (Contagion émotionnelle)</w:t>
+              <w:t>Hennig-Thurau et al. (2006) : Contagion affective authentique.</w:t>
             </w:r>
           </w:p>
         </w:tc>
@@ -3040,7 +3059,7 @@
               <w:rPr>
                 <w:sz w:val="16"/>
               </w:rPr>
-              <w:t>Découpage du verbatim en autoconfrontation (intentions, peurs, actions).</w:t>
+              <w:t>Découpage sémiotique du verbatim en unités d'expérience vécue</w:t>
             </w:r>
           </w:p>
         </w:tc>
@@ -3060,7 +3079,7 @@
               <w:rPr>
                 <w:sz w:val="16"/>
               </w:rPr>
-              <w:t>Permet de comprendre le sens que l'étudiant donnait à son comportement.</w:t>
+              <w:t>Verbatim autoconfrontation</w:t>
             </w:r>
           </w:p>
         </w:tc>
@@ -3080,7 +3099,7 @@
               <w:rPr>
                 <w:sz w:val="16"/>
               </w:rPr>
-              <w:t>Theureau / Durand (2016) (Cours d'action)</w:t>
+              <w:t>Theureau / Durand (2016) : Reconstitution du sens pour l'acteur.</w:t>
             </w:r>
           </w:p>
         </w:tc>
@@ -3102,7 +3121,7 @@
               <w:rPr>
                 <w:sz w:val="16"/>
               </w:rPr>
-              <w:t>Dilemmes décisionnels exprimés</w:t>
+              <w:t>Dilemmes Décisionnels Exprimés</w:t>
             </w:r>
           </w:p>
         </w:tc>
@@ -3122,7 +3141,7 @@
               <w:rPr>
                 <w:sz w:val="16"/>
               </w:rPr>
-              <w:t>Nombre de conflits intérieurs verbalisés (ex. : peur d'insister pour l'upselling).</w:t>
+              <w:t>Nombre de conflits intérieurs verbalisés durant l'autoconfrontation</w:t>
             </w:r>
           </w:p>
         </w:tc>
@@ -3142,7 +3161,7 @@
               <w:rPr>
                 <w:sz w:val="16"/>
               </w:rPr>
-              <w:t>Met au jour les freins psychologiques bloquant la vente.</w:t>
+              <w:t>Questions CDM (Crandall)</w:t>
             </w:r>
           </w:p>
         </w:tc>
@@ -3162,7 +3181,7 @@
               <w:rPr>
                 <w:sz w:val="16"/>
               </w:rPr>
-              <w:t>Crandall, Klein &amp; Hoffman (2006) (Méthode CDM)</w:t>
+              <w:t>Crandall, Klein &amp; Hoffman (2006) : Explicitation des savoirs tacites.</w:t>
             </w:r>
           </w:p>
         </w:tc>
@@ -3184,7 +3203,7 @@
           <w:color w:val="1B365D"/>
           <w:sz w:val="30"/>
         </w:rPr>
-        <w:t>5. Recommandations Stratégiques pour Jérôme Foguenne</w:t>
+        <w:t>5. Recommandations Décisionnelles pour Jérôme Foguenne</w:t>
       </w:r>
     </w:p>
     <w:p>
@@ -3192,14 +3211,14 @@
         <w:spacing w:line="276" w:lineRule="auto"/>
       </w:pPr>
       <w:r>
-        <w:t>1. Option Recommandée pour l'HECh (Impact Formation Immédiat) :</w:t>
+        <w:t>1. Recommandation pour l'Impact Pédagogique Immédiat (Valorisation HECh/HEL) :</w:t>
         <w:br/>
-        <w:t>Si votre priorité est de valoriser immédiatement l'achat de vos lunettes Pupil Labs Neon auprès de votre direction et de vos étudiants en créant un outil de cours innovant, choisissez la PROPOSITION 2 (Intervention Didactique EMME Spotlight). En 10 mois, vous disposez d'un dispositif pédagogique novateur, testé scientifiquement et utilisable chaque année avec vos étudiants sur Moodle.</w:t>
+        <w:t>Si votre objectif prioritaire est de valoriser immédiatement l'équipement Pupil Labs Neon auprès de la direction de la Haute École et des étudiants, déployez la PROPOSITION 2 (Intervention Didactique EMME Spotlight). En 10 mois, vous réalisez un essai contrôlé randomisé irréprochable et produisez 4 modules Moodle pérennes.</w:t>
         <w:br/>
         <w:br/>
-        <w:t>2. Option Recommandée pour la Recherche Pure (Publications Internationales) :</w:t>
+        <w:t>2. Recommandation pour la Recherche Pure (Publications Internationales &amp; Thèse) :</w:t>
         <w:br/>
-        <w:t>Si votre objectif prioritaire est de positionner le Lab-DRA au plus haut niveau scientifique pour attirer des financements de recherche externe, commencez par la PROPOSITION 1 (Comparatif Experts/Novices) en Année 1. Elle posera les bases objectives indispensables pour aborder ensuite la PROPOSITION 3 (Dyadique) dans le cadre d'un doctorat ou d'un projet de recherche pluriannuel d'envergure.</w:t>
+        <w:t>Si votre ambition est de positionner le Lab-DRA au plus haut niveau de la recherche internationale, commencez par la PROPOSITION 1 (Comparatif Novices/Experts) en Année 1. Elle vous fournira les données normatives de base pour lancer ensuite la PROPOSITION 3 (Dyadique Dual Eye Tracking) dans le cadre d'un doctorat ou d'un projet financé d'envergure.</w:t>
       </w:r>
     </w:p>
     <w:sectPr>
@@ -3222,7 +3241,7 @@
       <w:jc w:val="center"/>
     </w:pPr>
     <w:r>
-      <w:t>HECh / HEL — Jérôme Foguenne (Chercheur Principal)  |  Guide Méthodologique Approfondi</w:t>
+      <w:t>HECh / HEL — Jérôme Foguenne (Chercheur Principal)  |  Traité de Recherche Appliquée</w:t>
     </w:r>
   </w:p>
 </w:ftr>
@@ -3236,7 +3255,7 @@
       <w:jc w:val="right"/>
     </w:pPr>
     <w:r>
-      <w:t>Lab-DRA | SIMACCUEIL — Guide Méthodologique Opérationnel &amp; Vulgarisé</w:t>
+      <w:t>Lab-DRA | SIMACCUEIL — Traité Méthodologique Exhaustif &amp; Opérationnel</w:t>
     </w:r>
   </w:p>
 </w:hdr>

</xml_diff>